<commit_message>
add new pages, templates, CSS variables, and update existing files
- Add about.html, css/variables.css, html/templates/, templates/
- Add document templates (lettre, CV, charte)
- Update CSS and HTML files
- Untrack .DS_Store

Co-Authored-By: Claude Sonnet 4.6 <noreply@anthropic.com>
</commit_message>
<xml_diff>
--- a/repos/website/template_charte.docx
+++ b/repos/website/template_charte.docx
@@ -19,13 +19,14 @@
       <w:pPr>
         <w:pStyle w:val="Heading1"/>
         <w:spacing w:before="120" w:after="80"/>
-        <w:jc w:val="left"/>
       </w:pPr>
       <w:r>
         <w:rPr>
           <w:rFonts w:ascii="Times New Roman" w:cs="Times New Roman" w:eastAsia="Times New Roman" w:hAnsi="Times New Roman"/>
           <w:b/>
           <w:bCs/>
+          <w:i w:val="false"/>
+          <w:iCs w:val="false"/>
           <w:color w:val="111111"/>
           <w:sz w:val="52"/>
           <w:szCs w:val="52"/>
@@ -40,13 +41,15 @@
       <w:r>
         <w:rPr>
           <w:rFonts w:ascii="Times New Roman" w:cs="Times New Roman" w:eastAsia="Times New Roman" w:hAnsi="Times New Roman"/>
+          <w:b w:val="false"/>
+          <w:bCs w:val="false"/>
           <w:i/>
           <w:iCs/>
           <w:color w:val="666666"/>
           <w:sz w:val="26"/>
           <w:szCs w:val="26"/>
         </w:rPr>
-        <w:t xml:space="preserve">Sous-titre ou description de l'objet du document</w:t>
+        <w:t xml:space="preserve">Sous-titre ou description du document</w:t>
       </w:r>
     </w:p>
     <w:p>
@@ -66,6 +69,8 @@
           <w:rFonts w:ascii="Times New Roman" w:cs="Times New Roman" w:eastAsia="Times New Roman" w:hAnsi="Times New Roman"/>
           <w:b/>
           <w:bCs/>
+          <w:i w:val="false"/>
+          <w:iCs w:val="false"/>
           <w:color w:val="111111"/>
           <w:sz w:val="20"/>
           <w:szCs w:val="20"/>
@@ -75,6 +80,10 @@
       <w:r>
         <w:rPr>
           <w:rFonts w:ascii="Times New Roman" w:cs="Times New Roman" w:eastAsia="Times New Roman" w:hAnsi="Times New Roman"/>
+          <w:b w:val="false"/>
+          <w:bCs w:val="false"/>
+          <w:i w:val="false"/>
+          <w:iCs w:val="false"/>
           <w:color w:val="333333"/>
           <w:sz w:val="20"/>
           <w:szCs w:val="20"/>
@@ -83,14 +92,14 @@
       </w:r>
       <w:r>
         <w:br/>
-        <w:t xml:space="preserve">
-</w:t>
       </w:r>
       <w:r>
         <w:rPr>
           <w:rFonts w:ascii="Times New Roman" w:cs="Times New Roman" w:eastAsia="Times New Roman" w:hAnsi="Times New Roman"/>
           <w:b/>
           <w:bCs/>
+          <w:i w:val="false"/>
+          <w:iCs w:val="false"/>
           <w:color w:val="111111"/>
           <w:sz w:val="20"/>
           <w:szCs w:val="20"/>
@@ -100,37 +109,16 @@
       <w:r>
         <w:rPr>
           <w:rFonts w:ascii="Times New Roman" w:cs="Times New Roman" w:eastAsia="Times New Roman" w:hAnsi="Times New Roman"/>
+          <w:b w:val="false"/>
+          <w:bCs w:val="false"/>
+          <w:i w:val="false"/>
+          <w:iCs w:val="false"/>
           <w:color w:val="333333"/>
           <w:sz w:val="20"/>
           <w:szCs w:val="20"/>
         </w:rPr>
         <w:t xml:space="preserve">Mars 2026</w:t>
       </w:r>
-      <w:r>
-        <w:br/>
-        <w:t xml:space="preserve">
-</w:t>
-      </w:r>
-      <w:r>
-        <w:rPr>
-          <w:rFonts w:ascii="Times New Roman" w:cs="Times New Roman" w:eastAsia="Times New Roman" w:hAnsi="Times New Roman"/>
-          <w:b/>
-          <w:bCs/>
-          <w:color w:val="111111"/>
-          <w:sz w:val="20"/>
-          <w:szCs w:val="20"/>
-        </w:rPr>
-        <w:t xml:space="preserve">Version : </w:t>
-      </w:r>
-      <w:r>
-        <w:rPr>
-          <w:rFonts w:ascii="Times New Roman" w:cs="Times New Roman" w:eastAsia="Times New Roman" w:hAnsi="Times New Roman"/>
-          <w:color w:val="333333"/>
-          <w:sz w:val="20"/>
-          <w:szCs w:val="20"/>
-        </w:rPr>
-        <w:t xml:space="preserve">1.0</w:t>
-      </w:r>
     </w:p>
     <w:p>
       <w:r>
@@ -144,6 +132,10 @@
       <w:r>
         <w:rPr>
           <w:rFonts w:ascii="Courier New" w:cs="Courier New" w:eastAsia="Courier New" w:hAnsi="Courier New"/>
+          <w:b w:val="false"/>
+          <w:bCs w:val="false"/>
+          <w:i w:val="false"/>
+          <w:iCs w:val="false"/>
           <w:color w:val="AAAAAA"/>
           <w:sz w:val="16"/>
           <w:szCs w:val="16"/>
@@ -182,6 +174,10 @@
       <w:r>
         <w:rPr>
           <w:rFonts w:ascii="Courier New" w:cs="Courier New" w:eastAsia="Courier New" w:hAnsi="Courier New"/>
+          <w:b w:val="false"/>
+          <w:bCs w:val="false"/>
+          <w:i w:val="false"/>
+          <w:iCs w:val="false"/>
           <w:color w:val="AAAAAA"/>
           <w:sz w:val="16"/>
           <w:szCs w:val="16"/>
@@ -200,6 +196,8 @@
           <w:rFonts w:ascii="Times New Roman" w:cs="Times New Roman" w:eastAsia="Times New Roman" w:hAnsi="Times New Roman"/>
           <w:b/>
           <w:bCs/>
+          <w:i w:val="false"/>
+          <w:iCs w:val="false"/>
           <w:color w:val="111111"/>
           <w:sz w:val="34"/>
           <w:szCs w:val="34"/>
@@ -232,7 +230,7 @@
           <w:sz w:val="22"/>
           <w:szCs w:val="22"/>
         </w:rPr>
-        <w:t xml:space="preserve">Corps du texte justifié en Times New Roman 11 pt, interlignage 1,45 (16 pt). Ce paragraphe illustre le style de texte courant conforme à la charte. Les marges de 28 mm laissent un espace généreux pour des annotations marginales.</w:t>
+        <w:t xml:space="preserve">Corps du texte justifié en Times New Roman 11 pt. Les marges de 28 mm laissent de l'espace pour les annotations.</w:t>
       </w:r>
     </w:p>
     <w:p>
@@ -252,7 +250,12 @@
           <w:sz w:val="22"/>
           <w:szCs w:val="22"/>
         </w:rPr>
-        <w:t xml:space="preserve">Second paragraphe. L'espacement entre paragraphes est de 6 pt — suffisant pour marquer la séparation sans briser le flux de lecture. Notez l'absence d'indentation de première ligne, conformément au style académique contemporain.</w:t>
+        <w:t xml:space="preserve">Les variables sont composées en italique : soit f : ℝⁿ → ℝ une fonction de classe C¹, et ||x|| la norme euclidienne de x ∈ ℝⁿ.</w:t>
+      </w:r>
+    </w:p>
+    <w:p>
+      <w:r>
+        <w:br w:type="page"/>
       </w:r>
     </w:p>
     <w:p>
@@ -262,30 +265,44 @@
       <w:r>
         <w:rPr>
           <w:rFonts w:ascii="Courier New" w:cs="Courier New" w:eastAsia="Courier New" w:hAnsi="Courier New"/>
+          <w:b w:val="false"/>
+          <w:bCs w:val="false"/>
+          <w:i w:val="false"/>
+          <w:iCs w:val="false"/>
           <w:color w:val="AAAAAA"/>
           <w:sz w:val="16"/>
           <w:szCs w:val="16"/>
         </w:rPr>
-        <w:t xml:space="preserve">§ 1.1</w:t>
+        <w:t xml:space="preserve">§ 2</w:t>
       </w:r>
     </w:p>
     <w:p>
       <w:pPr>
-        <w:pStyle w:val="Heading2"/>
-        <w:spacing w:before="360" w:after="120"/>
-        <w:outlineLvl w:val="1"/>
+        <w:pStyle w:val="Heading1"/>
+        <w:spacing w:before="120" w:after="200"/>
+        <w:outlineLvl w:val="0"/>
       </w:pPr>
       <w:r>
         <w:rPr>
           <w:rFonts w:ascii="Times New Roman" w:cs="Times New Roman" w:eastAsia="Times New Roman" w:hAnsi="Times New Roman"/>
           <w:b/>
           <w:bCs/>
+          <w:i w:val="false"/>
+          <w:iCs w:val="false"/>
           <w:color w:val="111111"/>
-          <w:sz w:val="26"/>
-          <w:szCs w:val="26"/>
+          <w:sz w:val="34"/>
+          <w:szCs w:val="34"/>
         </w:rPr>
-        <w:t xml:space="preserve">Contexte et motivations</w:t>
+        <w:t xml:space="preserve">Environnements mathématiques</w:t>
       </w:r>
+    </w:p>
+    <w:p>
+      <w:pPr>
+        <w:pBdr>
+          <w:bottom w:val="single" w:color="CCCCCC" w:sz="2" w:space="4"/>
+        </w:pBdr>
+        <w:spacing w:before="80" w:after="80"/>
+      </w:pPr>
     </w:p>
     <w:p>
       <w:pPr>
@@ -304,12 +321,7 @@
           <w:sz w:val="22"/>
           <w:szCs w:val="22"/>
         </w:rPr>
-        <w:t xml:space="preserve">Sous-section avec numérotation § 1.1. Le texte peut contenir des termes en italique comme — par exemple, un titre d'ouvrage en italique ou une variable mathématique x, n, σ — et des passages en monospace pour les identificateurs comme kmp_search ou les commandes.</w:t>
-      </w:r>
-    </w:p>
-    <w:p>
-      <w:r>
-        <w:br w:type="page"/>
+        <w:t xml:space="preserve">Tous les environnements sont numérotés par section (ex. : Théorème 2.1, Exemple 2.1). Le compteur Définition/Théorème/Proposition/Lemme/Corollaire est partagé. Exemple et Remarque ont leur propre compteur. Exercice est numéroté indépendamment.</w:t>
       </w:r>
     </w:p>
     <w:p>
@@ -319,29 +331,2003 @@
       <w:r>
         <w:rPr>
           <w:rFonts w:ascii="Courier New" w:cs="Courier New" w:eastAsia="Courier New" w:hAnsi="Courier New"/>
+          <w:b w:val="false"/>
+          <w:bCs w:val="false"/>
+          <w:i w:val="false"/>
+          <w:iCs w:val="false"/>
           <w:color w:val="AAAAAA"/>
           <w:sz w:val="16"/>
           <w:szCs w:val="16"/>
         </w:rPr>
-        <w:t xml:space="preserve">§ 2</w:t>
+        <w:t xml:space="preserve">§ 2.1</w:t>
       </w:r>
     </w:p>
     <w:p>
       <w:pPr>
-        <w:pStyle w:val="Heading1"/>
-        <w:spacing w:before="120" w:after="200"/>
-        <w:outlineLvl w:val="0"/>
+        <w:pStyle w:val="Heading2"/>
+        <w:spacing w:before="360" w:after="120"/>
+        <w:outlineLvl w:val="1"/>
       </w:pPr>
       <w:r>
         <w:rPr>
           <w:rFonts w:ascii="Times New Roman" w:cs="Times New Roman" w:eastAsia="Times New Roman" w:hAnsi="Times New Roman"/>
           <w:b/>
           <w:bCs/>
+          <w:i w:val="false"/>
+          <w:iCs w:val="false"/>
+          <w:color w:val="111111"/>
+          <w:sz w:val="26"/>
+          <w:szCs w:val="26"/>
+        </w:rPr>
+        <w:t xml:space="preserve">Définitions et théorèmes</w:t>
+      </w:r>
+    </w:p>
+    <w:p>
+      <w:pPr>
+        <w:spacing w:before="160" w:after="0"/>
+      </w:pPr>
+    </w:p>
+    <w:tbl>
+      <w:tblPr>
+        <w:tblW w:type="dxa" w:w="9360"/>
+        <w:tblBorders>
+          <w:top w:val="none" w:color="FFFFFF" w:sz="0"/>
+          <w:left w:val="none" w:color="FFFFFF" w:sz="0"/>
+          <w:bottom w:val="none" w:color="FFFFFF" w:sz="0"/>
+          <w:right w:val="none" w:color="FFFFFF" w:sz="0"/>
+          <w:insideH w:val="single" w:color="auto" w:sz="4"/>
+          <w:insideV w:val="single" w:color="auto" w:sz="4"/>
+        </w:tblBorders>
+      </w:tblPr>
+      <w:tblGrid>
+        <w:gridCol w:w="9360"/>
+      </w:tblGrid>
+      <w:tr>
+        <w:tc>
+          <w:tcPr>
+            <w:tcW w:type="dxa" w:w="9260"/>
+            <w:tcBorders>
+              <w:top w:val="none" w:color="FFFFFF" w:sz="0"/>
+              <w:left w:val="none" w:color="FFFFFF" w:sz="0"/>
+              <w:bottom w:val="none" w:color="FFFFFF" w:sz="0"/>
+              <w:right w:val="none" w:color="FFFFFF" w:sz="0"/>
+            </w:tcBorders>
+            <w:shd w:fill="F5F5F5" w:val="clear"/>
+            <w:tcMar>
+              <w:top w:type="dxa" w:w="0"/>
+              <w:left w:type="dxa" w:w="100"/>
+              <w:bottom w:type="dxa" w:w="0"/>
+              <w:right w:type="dxa" w:w="100"/>
+            </w:tcMar>
+          </w:tcPr>
+          <w:p>
+            <w:pPr>
+              <w:spacing w:before="0" w:after="60"/>
+            </w:pPr>
+            <w:r>
+              <w:rPr>
+                <w:rFonts w:ascii="Times New Roman" w:cs="Times New Roman" w:eastAsia="Times New Roman" w:hAnsi="Times New Roman"/>
+                <w:b/>
+                <w:bCs/>
+                <w:i w:val="false"/>
+                <w:iCs w:val="false"/>
+                <w:color w:val="111111"/>
+                <w:sz w:val="20"/>
+                <w:szCs w:val="20"/>
+              </w:rPr>
+              <w:t xml:space="preserve">Définition 2.1</w:t>
+            </w:r>
+            <w:r>
+              <w:rPr>
+                <w:rFonts w:ascii="Times New Roman" w:cs="Times New Roman" w:eastAsia="Times New Roman" w:hAnsi="Times New Roman"/>
+                <w:b w:val="false"/>
+                <w:bCs w:val="false"/>
+                <w:i/>
+                <w:iCs/>
+                <w:color w:val="111111"/>
+                <w:sz w:val="20"/>
+                <w:szCs w:val="20"/>
+              </w:rPr>
+              <w:t xml:space="preserve"> — Convergence uniforme</w:t>
+            </w:r>
+            <w:r>
+              <w:rPr>
+                <w:rFonts w:ascii="Times New Roman" w:cs="Times New Roman" w:eastAsia="Times New Roman" w:hAnsi="Times New Roman"/>
+                <w:b/>
+                <w:bCs/>
+                <w:i w:val="false"/>
+                <w:iCs w:val="false"/>
+                <w:color w:val="111111"/>
+                <w:sz w:val="20"/>
+                <w:szCs w:val="20"/>
+              </w:rPr>
+              <w:t xml:space="preserve">.</w:t>
+            </w:r>
+            <w:r>
+              <w:rPr>
+                <w:rFonts w:ascii="Times New Roman" w:cs="Times New Roman" w:eastAsia="Times New Roman" w:hAnsi="Times New Roman"/>
+                <w:b w:val="false"/>
+                <w:bCs w:val="false"/>
+                <w:i w:val="false"/>
+                <w:iCs w:val="false"/>
+                <w:color w:val="111111"/>
+                <w:sz w:val="20"/>
+                <w:szCs w:val="20"/>
+              </w:rPr>
+              <w:t xml:space="preserve"> </w:t>
+            </w:r>
+          </w:p>
+        </w:tc>
+      </w:tr>
+      <w:tr>
+        <w:tc>
+          <w:tcPr>
+            <w:tcW w:type="dxa" w:w="9260"/>
+            <w:tcBorders>
+              <w:top w:val="none" w:color="FFFFFF" w:sz="0"/>
+              <w:left w:val="none" w:color="FFFFFF" w:sz="0"/>
+              <w:bottom w:val="none" w:color="FFFFFF" w:sz="0"/>
+              <w:right w:val="none" w:color="FFFFFF" w:sz="0"/>
+            </w:tcBorders>
+            <w:shd w:fill="F5F5F5" w:val="clear"/>
+            <w:tcMar>
+              <w:top w:type="dxa" w:w="0"/>
+              <w:left w:type="dxa" w:w="100"/>
+              <w:bottom w:type="dxa" w:w="0"/>
+              <w:right w:type="dxa" w:w="100"/>
+            </w:tcMar>
+          </w:tcPr>
+          <w:p>
+            <w:pPr>
+              <w:spacing w:before="0" w:after="60" w:line="340"/>
+              <w:jc w:val="both"/>
+            </w:pPr>
+            <w:r>
+              <w:rPr>
+                <w:rFonts w:ascii="Times New Roman" w:cs="Times New Roman" w:eastAsia="Times New Roman" w:hAnsi="Times New Roman"/>
+                <w:b w:val="false"/>
+                <w:bCs w:val="false"/>
+                <w:i w:val="false"/>
+                <w:iCs w:val="false"/>
+                <w:color w:val="111111"/>
+                <w:sz w:val="20"/>
+                <w:szCs w:val="20"/>
+              </w:rPr>
+              <w:t xml:space="preserve">Une suite de fonctions (fₙ) converge uniformément vers f sur A ⊂ ℝ si pour tout ε &gt; 0, il existe N ∈ ℕ tel que pour tout n ≥ N et tout x ∈ A, |fₙ(x) − f(x)| &lt; ε.</w:t>
+            </w:r>
+          </w:p>
+        </w:tc>
+      </w:tr>
+    </w:tbl>
+    <w:p>
+      <w:pPr>
+        <w:spacing w:before="80" w:after="0"/>
+      </w:pPr>
+    </w:p>
+    <w:p>
+      <w:pPr>
+        <w:spacing w:before="160" w:after="0"/>
+      </w:pPr>
+    </w:p>
+    <w:tbl>
+      <w:tblPr>
+        <w:tblW w:type="dxa" w:w="9360"/>
+        <w:tblBorders>
+          <w:top w:val="none" w:color="FFFFFF" w:sz="0"/>
+          <w:left w:val="none" w:color="FFFFFF" w:sz="0"/>
+          <w:bottom w:val="none" w:color="FFFFFF" w:sz="0"/>
+          <w:right w:val="none" w:color="FFFFFF" w:sz="0"/>
+          <w:insideH w:val="single" w:color="auto" w:sz="4"/>
+          <w:insideV w:val="single" w:color="auto" w:sz="4"/>
+        </w:tblBorders>
+      </w:tblPr>
+      <w:tblGrid>
+        <w:gridCol w:w="9360"/>
+      </w:tblGrid>
+      <w:tr>
+        <w:tc>
+          <w:tcPr>
+            <w:tcW w:type="dxa" w:w="9260"/>
+            <w:tcBorders>
+              <w:top w:val="none" w:color="FFFFFF" w:sz="0"/>
+              <w:left w:val="none" w:color="FFFFFF" w:sz="0"/>
+              <w:bottom w:val="none" w:color="FFFFFF" w:sz="0"/>
+              <w:right w:val="none" w:color="FFFFFF" w:sz="0"/>
+            </w:tcBorders>
+            <w:shd w:fill="F5F5F5" w:val="clear"/>
+            <w:tcMar>
+              <w:top w:type="dxa" w:w="0"/>
+              <w:left w:type="dxa" w:w="100"/>
+              <w:bottom w:type="dxa" w:w="0"/>
+              <w:right w:type="dxa" w:w="100"/>
+            </w:tcMar>
+          </w:tcPr>
+          <w:p>
+            <w:pPr>
+              <w:spacing w:before="0" w:after="60"/>
+            </w:pPr>
+            <w:r>
+              <w:rPr>
+                <w:rFonts w:ascii="Times New Roman" w:cs="Times New Roman" w:eastAsia="Times New Roman" w:hAnsi="Times New Roman"/>
+                <w:b/>
+                <w:bCs/>
+                <w:i w:val="false"/>
+                <w:iCs w:val="false"/>
+                <w:color w:val="111111"/>
+                <w:sz w:val="20"/>
+                <w:szCs w:val="20"/>
+              </w:rPr>
+              <w:t xml:space="preserve">Théorème 2.2</w:t>
+            </w:r>
+            <w:r>
+              <w:rPr>
+                <w:rFonts w:ascii="Times New Roman" w:cs="Times New Roman" w:eastAsia="Times New Roman" w:hAnsi="Times New Roman"/>
+                <w:b w:val="false"/>
+                <w:bCs w:val="false"/>
+                <w:i/>
+                <w:iCs/>
+                <w:color w:val="111111"/>
+                <w:sz w:val="20"/>
+                <w:szCs w:val="20"/>
+              </w:rPr>
+              <w:t xml:space="preserve"> — Borne inférieure du tri</w:t>
+            </w:r>
+            <w:r>
+              <w:rPr>
+                <w:rFonts w:ascii="Times New Roman" w:cs="Times New Roman" w:eastAsia="Times New Roman" w:hAnsi="Times New Roman"/>
+                <w:b/>
+                <w:bCs/>
+                <w:i w:val="false"/>
+                <w:iCs w:val="false"/>
+                <w:color w:val="111111"/>
+                <w:sz w:val="20"/>
+                <w:szCs w:val="20"/>
+              </w:rPr>
+              <w:t xml:space="preserve">.</w:t>
+            </w:r>
+            <w:r>
+              <w:rPr>
+                <w:rFonts w:ascii="Times New Roman" w:cs="Times New Roman" w:eastAsia="Times New Roman" w:hAnsi="Times New Roman"/>
+                <w:b w:val="false"/>
+                <w:bCs w:val="false"/>
+                <w:i w:val="false"/>
+                <w:iCs w:val="false"/>
+                <w:color w:val="111111"/>
+                <w:sz w:val="20"/>
+                <w:szCs w:val="20"/>
+              </w:rPr>
+              <w:t xml:space="preserve"> </w:t>
+            </w:r>
+          </w:p>
+        </w:tc>
+      </w:tr>
+      <w:tr>
+        <w:tc>
+          <w:tcPr>
+            <w:tcW w:type="dxa" w:w="9260"/>
+            <w:tcBorders>
+              <w:top w:val="none" w:color="FFFFFF" w:sz="0"/>
+              <w:left w:val="none" w:color="FFFFFF" w:sz="0"/>
+              <w:bottom w:val="none" w:color="FFFFFF" w:sz="0"/>
+              <w:right w:val="none" w:color="FFFFFF" w:sz="0"/>
+            </w:tcBorders>
+            <w:shd w:fill="F5F5F5" w:val="clear"/>
+            <w:tcMar>
+              <w:top w:type="dxa" w:w="0"/>
+              <w:left w:type="dxa" w:w="100"/>
+              <w:bottom w:type="dxa" w:w="0"/>
+              <w:right w:type="dxa" w:w="100"/>
+            </w:tcMar>
+          </w:tcPr>
+          <w:p>
+            <w:pPr>
+              <w:spacing w:before="0" w:after="60" w:line="340"/>
+              <w:jc w:val="both"/>
+            </w:pPr>
+            <w:r>
+              <w:rPr>
+                <w:rFonts w:ascii="Times New Roman" w:cs="Times New Roman" w:eastAsia="Times New Roman" w:hAnsi="Times New Roman"/>
+                <w:b w:val="false"/>
+                <w:bCs w:val="false"/>
+                <w:i w:val="false"/>
+                <w:iCs w:val="false"/>
+                <w:color w:val="111111"/>
+                <w:sz w:val="20"/>
+                <w:szCs w:val="20"/>
+              </w:rPr>
+              <w:t xml:space="preserve">Tout algorithme de tri par comparaison requiert Ω(n log n) comparaisons dans le pire cas.</w:t>
+            </w:r>
+          </w:p>
+        </w:tc>
+      </w:tr>
+    </w:tbl>
+    <w:p>
+      <w:pPr>
+        <w:spacing w:before="80" w:after="0"/>
+      </w:pPr>
+    </w:p>
+    <w:p>
+      <w:pPr>
+        <w:spacing w:before="80" w:after="0"/>
+      </w:pPr>
+    </w:p>
+    <w:p>
+      <w:pPr>
+        <w:spacing w:before="0" w:after="80" w:line="340"/>
+        <w:jc w:val="both"/>
+      </w:pPr>
+      <w:r>
+        <w:rPr>
+          <w:rFonts w:ascii="Times New Roman" w:cs="Times New Roman" w:eastAsia="Times New Roman" w:hAnsi="Times New Roman"/>
+          <w:b w:val="false"/>
+          <w:bCs w:val="false"/>
+          <w:i/>
+          <w:iCs/>
+          <w:color w:val="111111"/>
+          <w:sz w:val="20"/>
+          <w:szCs w:val="20"/>
+        </w:rPr>
+        <w:t xml:space="preserve">Démonstration. </w:t>
+      </w:r>
+      <w:r>
+        <w:rPr>
+          <w:rFonts w:ascii="Times New Roman" w:cs="Times New Roman" w:eastAsia="Times New Roman" w:hAnsi="Times New Roman"/>
+          <w:b w:val="false"/>
+          <w:bCs w:val="false"/>
+          <w:i w:val="false"/>
+          <w:iCs w:val="false"/>
+          <w:color w:val="111111"/>
+          <w:sz w:val="20"/>
+          <w:szCs w:val="20"/>
+        </w:rPr>
+        <w:t xml:space="preserve">L'arbre de décision sur n éléments possède au moins n! feuilles, donc une hauteur au moins log₂(n!) = Ω(n log n). ■</w:t>
+      </w:r>
+    </w:p>
+    <w:p>
+      <w:pPr>
+        <w:spacing w:before="40" w:after="0"/>
+      </w:pPr>
+    </w:p>
+    <w:p>
+      <w:pPr>
+        <w:spacing w:before="160" w:after="0"/>
+      </w:pPr>
+    </w:p>
+    <w:tbl>
+      <w:tblPr>
+        <w:tblW w:type="dxa" w:w="9360"/>
+        <w:tblBorders>
+          <w:top w:val="none" w:color="FFFFFF" w:sz="0"/>
+          <w:left w:val="none" w:color="FFFFFF" w:sz="0"/>
+          <w:bottom w:val="none" w:color="FFFFFF" w:sz="0"/>
+          <w:right w:val="none" w:color="FFFFFF" w:sz="0"/>
+          <w:insideH w:val="single" w:color="auto" w:sz="4"/>
+          <w:insideV w:val="single" w:color="auto" w:sz="4"/>
+        </w:tblBorders>
+      </w:tblPr>
+      <w:tblGrid>
+        <w:gridCol w:w="9360"/>
+      </w:tblGrid>
+      <w:tr>
+        <w:tc>
+          <w:tcPr>
+            <w:tcW w:type="dxa" w:w="9260"/>
+            <w:tcBorders>
+              <w:top w:val="none" w:color="FFFFFF" w:sz="0"/>
+              <w:left w:val="none" w:color="FFFFFF" w:sz="0"/>
+              <w:bottom w:val="none" w:color="FFFFFF" w:sz="0"/>
+              <w:right w:val="none" w:color="FFFFFF" w:sz="0"/>
+            </w:tcBorders>
+            <w:shd w:fill="F5F5F5" w:val="clear"/>
+            <w:tcMar>
+              <w:top w:type="dxa" w:w="0"/>
+              <w:left w:type="dxa" w:w="100"/>
+              <w:bottom w:type="dxa" w:w="0"/>
+              <w:right w:type="dxa" w:w="100"/>
+            </w:tcMar>
+          </w:tcPr>
+          <w:p>
+            <w:pPr>
+              <w:spacing w:before="0" w:after="60"/>
+            </w:pPr>
+            <w:r>
+              <w:rPr>
+                <w:rFonts w:ascii="Times New Roman" w:cs="Times New Roman" w:eastAsia="Times New Roman" w:hAnsi="Times New Roman"/>
+                <w:b/>
+                <w:bCs/>
+                <w:i w:val="false"/>
+                <w:iCs w:val="false"/>
+                <w:color w:val="111111"/>
+                <w:sz w:val="20"/>
+                <w:szCs w:val="20"/>
+              </w:rPr>
+              <w:t xml:space="preserve">Proposition 2.3</w:t>
+            </w:r>
+            <w:r>
+              <w:rPr>
+                <w:rFonts w:ascii="Times New Roman" w:cs="Times New Roman" w:eastAsia="Times New Roman" w:hAnsi="Times New Roman"/>
+                <w:b w:val="false"/>
+                <w:bCs w:val="false"/>
+                <w:i/>
+                <w:iCs/>
+                <w:color w:val="111111"/>
+                <w:sz w:val="20"/>
+                <w:szCs w:val="20"/>
+              </w:rPr>
+              <w:t xml:space="preserve"> — Critère de Cauchy</w:t>
+            </w:r>
+            <w:r>
+              <w:rPr>
+                <w:rFonts w:ascii="Times New Roman" w:cs="Times New Roman" w:eastAsia="Times New Roman" w:hAnsi="Times New Roman"/>
+                <w:b/>
+                <w:bCs/>
+                <w:i w:val="false"/>
+                <w:iCs w:val="false"/>
+                <w:color w:val="111111"/>
+                <w:sz w:val="20"/>
+                <w:szCs w:val="20"/>
+              </w:rPr>
+              <w:t xml:space="preserve">.</w:t>
+            </w:r>
+            <w:r>
+              <w:rPr>
+                <w:rFonts w:ascii="Times New Roman" w:cs="Times New Roman" w:eastAsia="Times New Roman" w:hAnsi="Times New Roman"/>
+                <w:b w:val="false"/>
+                <w:bCs w:val="false"/>
+                <w:i w:val="false"/>
+                <w:iCs w:val="false"/>
+                <w:color w:val="111111"/>
+                <w:sz w:val="20"/>
+                <w:szCs w:val="20"/>
+              </w:rPr>
+              <w:t xml:space="preserve"> </w:t>
+            </w:r>
+          </w:p>
+        </w:tc>
+      </w:tr>
+      <w:tr>
+        <w:tc>
+          <w:tcPr>
+            <w:tcW w:type="dxa" w:w="9260"/>
+            <w:tcBorders>
+              <w:top w:val="none" w:color="FFFFFF" w:sz="0"/>
+              <w:left w:val="none" w:color="FFFFFF" w:sz="0"/>
+              <w:bottom w:val="none" w:color="FFFFFF" w:sz="0"/>
+              <w:right w:val="none" w:color="FFFFFF" w:sz="0"/>
+            </w:tcBorders>
+            <w:shd w:fill="F5F5F5" w:val="clear"/>
+            <w:tcMar>
+              <w:top w:type="dxa" w:w="0"/>
+              <w:left w:type="dxa" w:w="100"/>
+              <w:bottom w:type="dxa" w:w="0"/>
+              <w:right w:type="dxa" w:w="100"/>
+            </w:tcMar>
+          </w:tcPr>
+          <w:p>
+            <w:pPr>
+              <w:spacing w:before="0" w:after="60" w:line="340"/>
+              <w:jc w:val="both"/>
+            </w:pPr>
+            <w:r>
+              <w:rPr>
+                <w:rFonts w:ascii="Times New Roman" w:cs="Times New Roman" w:eastAsia="Times New Roman" w:hAnsi="Times New Roman"/>
+                <w:b w:val="false"/>
+                <w:bCs w:val="false"/>
+                <w:i w:val="false"/>
+                <w:iCs w:val="false"/>
+                <w:color w:val="111111"/>
+                <w:sz w:val="20"/>
+                <w:szCs w:val="20"/>
+              </w:rPr>
+              <w:t xml:space="preserve">Une suite (uₙ) converge dans ℝ si et seulement si elle est de Cauchy : ∀ε &gt; 0, ∃N, ∀p,q ≥ N, |uₚ − u_q| &lt; ε.</w:t>
+            </w:r>
+          </w:p>
+        </w:tc>
+      </w:tr>
+    </w:tbl>
+    <w:p>
+      <w:pPr>
+        <w:spacing w:before="80" w:after="0"/>
+      </w:pPr>
+    </w:p>
+    <w:p>
+      <w:pPr>
+        <w:spacing w:before="160" w:after="0"/>
+      </w:pPr>
+    </w:p>
+    <w:tbl>
+      <w:tblPr>
+        <w:tblW w:type="dxa" w:w="9360"/>
+        <w:tblBorders>
+          <w:top w:val="none" w:color="FFFFFF" w:sz="0"/>
+          <w:left w:val="none" w:color="FFFFFF" w:sz="0"/>
+          <w:bottom w:val="none" w:color="FFFFFF" w:sz="0"/>
+          <w:right w:val="none" w:color="FFFFFF" w:sz="0"/>
+          <w:insideH w:val="single" w:color="auto" w:sz="4"/>
+          <w:insideV w:val="single" w:color="auto" w:sz="4"/>
+        </w:tblBorders>
+      </w:tblPr>
+      <w:tblGrid>
+        <w:gridCol w:w="9360"/>
+      </w:tblGrid>
+      <w:tr>
+        <w:tc>
+          <w:tcPr>
+            <w:tcW w:type="dxa" w:w="9260"/>
+            <w:tcBorders>
+              <w:top w:val="none" w:color="FFFFFF" w:sz="0"/>
+              <w:left w:val="none" w:color="FFFFFF" w:sz="0"/>
+              <w:bottom w:val="none" w:color="FFFFFF" w:sz="0"/>
+              <w:right w:val="none" w:color="FFFFFF" w:sz="0"/>
+            </w:tcBorders>
+            <w:shd w:fill="F5F5F5" w:val="clear"/>
+            <w:tcMar>
+              <w:top w:type="dxa" w:w="0"/>
+              <w:left w:type="dxa" w:w="100"/>
+              <w:bottom w:type="dxa" w:w="0"/>
+              <w:right w:type="dxa" w:w="100"/>
+            </w:tcMar>
+          </w:tcPr>
+          <w:p>
+            <w:pPr>
+              <w:spacing w:before="0" w:after="60"/>
+            </w:pPr>
+            <w:r>
+              <w:rPr>
+                <w:rFonts w:ascii="Times New Roman" w:cs="Times New Roman" w:eastAsia="Times New Roman" w:hAnsi="Times New Roman"/>
+                <w:b/>
+                <w:bCs/>
+                <w:i w:val="false"/>
+                <w:iCs w:val="false"/>
+                <w:color w:val="111111"/>
+                <w:sz w:val="20"/>
+                <w:szCs w:val="20"/>
+              </w:rPr>
+              <w:t xml:space="preserve">Lemme 2.4</w:t>
+            </w:r>
+            <w:r>
+              <w:rPr>
+                <w:rFonts w:ascii="Times New Roman" w:cs="Times New Roman" w:eastAsia="Times New Roman" w:hAnsi="Times New Roman"/>
+                <w:b w:val="false"/>
+                <w:bCs w:val="false"/>
+                <w:i/>
+                <w:iCs/>
+                <w:color w:val="111111"/>
+                <w:sz w:val="20"/>
+                <w:szCs w:val="20"/>
+              </w:rPr>
+              <w:t xml:space="preserve"> — Sous-suite extraite</w:t>
+            </w:r>
+            <w:r>
+              <w:rPr>
+                <w:rFonts w:ascii="Times New Roman" w:cs="Times New Roman" w:eastAsia="Times New Roman" w:hAnsi="Times New Roman"/>
+                <w:b/>
+                <w:bCs/>
+                <w:i w:val="false"/>
+                <w:iCs w:val="false"/>
+                <w:color w:val="111111"/>
+                <w:sz w:val="20"/>
+                <w:szCs w:val="20"/>
+              </w:rPr>
+              <w:t xml:space="preserve">.</w:t>
+            </w:r>
+            <w:r>
+              <w:rPr>
+                <w:rFonts w:ascii="Times New Roman" w:cs="Times New Roman" w:eastAsia="Times New Roman" w:hAnsi="Times New Roman"/>
+                <w:b w:val="false"/>
+                <w:bCs w:val="false"/>
+                <w:i w:val="false"/>
+                <w:iCs w:val="false"/>
+                <w:color w:val="111111"/>
+                <w:sz w:val="20"/>
+                <w:szCs w:val="20"/>
+              </w:rPr>
+              <w:t xml:space="preserve"> </w:t>
+            </w:r>
+          </w:p>
+        </w:tc>
+      </w:tr>
+      <w:tr>
+        <w:tc>
+          <w:tcPr>
+            <w:tcW w:type="dxa" w:w="9260"/>
+            <w:tcBorders>
+              <w:top w:val="none" w:color="FFFFFF" w:sz="0"/>
+              <w:left w:val="none" w:color="FFFFFF" w:sz="0"/>
+              <w:bottom w:val="none" w:color="FFFFFF" w:sz="0"/>
+              <w:right w:val="none" w:color="FFFFFF" w:sz="0"/>
+            </w:tcBorders>
+            <w:shd w:fill="F5F5F5" w:val="clear"/>
+            <w:tcMar>
+              <w:top w:type="dxa" w:w="0"/>
+              <w:left w:type="dxa" w:w="100"/>
+              <w:bottom w:type="dxa" w:w="0"/>
+              <w:right w:type="dxa" w:w="100"/>
+            </w:tcMar>
+          </w:tcPr>
+          <w:p>
+            <w:pPr>
+              <w:spacing w:before="0" w:after="60" w:line="340"/>
+              <w:jc w:val="both"/>
+            </w:pPr>
+            <w:r>
+              <w:rPr>
+                <w:rFonts w:ascii="Times New Roman" w:cs="Times New Roman" w:eastAsia="Times New Roman" w:hAnsi="Times New Roman"/>
+                <w:b w:val="false"/>
+                <w:bCs w:val="false"/>
+                <w:i w:val="false"/>
+                <w:iCs w:val="false"/>
+                <w:color w:val="111111"/>
+                <w:sz w:val="20"/>
+                <w:szCs w:val="20"/>
+              </w:rPr>
+              <w:t xml:space="preserve">Toute suite convergente est de Cauchy. La réciproque est vraie dans ℝ mais fausse dans ℚ.</w:t>
+            </w:r>
+          </w:p>
+        </w:tc>
+      </w:tr>
+    </w:tbl>
+    <w:p>
+      <w:pPr>
+        <w:spacing w:before="80" w:after="0"/>
+      </w:pPr>
+    </w:p>
+    <w:p>
+      <w:pPr>
+        <w:spacing w:before="160" w:after="0"/>
+      </w:pPr>
+    </w:p>
+    <w:tbl>
+      <w:tblPr>
+        <w:tblW w:type="dxa" w:w="9360"/>
+        <w:tblBorders>
+          <w:top w:val="none" w:color="FFFFFF" w:sz="0"/>
+          <w:left w:val="none" w:color="FFFFFF" w:sz="0"/>
+          <w:bottom w:val="none" w:color="FFFFFF" w:sz="0"/>
+          <w:right w:val="none" w:color="FFFFFF" w:sz="0"/>
+          <w:insideH w:val="single" w:color="auto" w:sz="4"/>
+          <w:insideV w:val="single" w:color="auto" w:sz="4"/>
+        </w:tblBorders>
+      </w:tblPr>
+      <w:tblGrid>
+        <w:gridCol w:w="9360"/>
+      </w:tblGrid>
+      <w:tr>
+        <w:tc>
+          <w:tcPr>
+            <w:tcW w:type="dxa" w:w="9260"/>
+            <w:tcBorders>
+              <w:top w:val="none" w:color="FFFFFF" w:sz="0"/>
+              <w:left w:val="none" w:color="FFFFFF" w:sz="0"/>
+              <w:bottom w:val="none" w:color="FFFFFF" w:sz="0"/>
+              <w:right w:val="none" w:color="FFFFFF" w:sz="0"/>
+            </w:tcBorders>
+            <w:shd w:fill="F5F5F5" w:val="clear"/>
+            <w:tcMar>
+              <w:top w:type="dxa" w:w="0"/>
+              <w:left w:type="dxa" w:w="100"/>
+              <w:bottom w:type="dxa" w:w="0"/>
+              <w:right w:type="dxa" w:w="100"/>
+            </w:tcMar>
+          </w:tcPr>
+          <w:p>
+            <w:pPr>
+              <w:spacing w:before="0" w:after="60"/>
+            </w:pPr>
+            <w:r>
+              <w:rPr>
+                <w:rFonts w:ascii="Times New Roman" w:cs="Times New Roman" w:eastAsia="Times New Roman" w:hAnsi="Times New Roman"/>
+                <w:b/>
+                <w:bCs/>
+                <w:i w:val="false"/>
+                <w:iCs w:val="false"/>
+                <w:color w:val="111111"/>
+                <w:sz w:val="20"/>
+                <w:szCs w:val="20"/>
+              </w:rPr>
+              <w:t xml:space="preserve">Corollaire 2.5</w:t>
+            </w:r>
+            <w:r>
+              <w:rPr>
+                <w:rFonts w:ascii="Times New Roman" w:cs="Times New Roman" w:eastAsia="Times New Roman" w:hAnsi="Times New Roman"/>
+                <w:b/>
+                <w:bCs/>
+                <w:i w:val="false"/>
+                <w:iCs w:val="false"/>
+                <w:color w:val="111111"/>
+                <w:sz w:val="20"/>
+                <w:szCs w:val="20"/>
+              </w:rPr>
+              <w:t xml:space="preserve">.</w:t>
+            </w:r>
+            <w:r>
+              <w:rPr>
+                <w:rFonts w:ascii="Times New Roman" w:cs="Times New Roman" w:eastAsia="Times New Roman" w:hAnsi="Times New Roman"/>
+                <w:b w:val="false"/>
+                <w:bCs w:val="false"/>
+                <w:i w:val="false"/>
+                <w:iCs w:val="false"/>
+                <w:color w:val="111111"/>
+                <w:sz w:val="20"/>
+                <w:szCs w:val="20"/>
+              </w:rPr>
+              <w:t xml:space="preserve"> </w:t>
+            </w:r>
+          </w:p>
+        </w:tc>
+      </w:tr>
+      <w:tr>
+        <w:tc>
+          <w:tcPr>
+            <w:tcW w:type="dxa" w:w="9260"/>
+            <w:tcBorders>
+              <w:top w:val="none" w:color="FFFFFF" w:sz="0"/>
+              <w:left w:val="none" w:color="FFFFFF" w:sz="0"/>
+              <w:bottom w:val="none" w:color="FFFFFF" w:sz="0"/>
+              <w:right w:val="none" w:color="FFFFFF" w:sz="0"/>
+            </w:tcBorders>
+            <w:shd w:fill="F5F5F5" w:val="clear"/>
+            <w:tcMar>
+              <w:top w:type="dxa" w:w="0"/>
+              <w:left w:type="dxa" w:w="100"/>
+              <w:bottom w:type="dxa" w:w="0"/>
+              <w:right w:type="dxa" w:w="100"/>
+            </w:tcMar>
+          </w:tcPr>
+          <w:p>
+            <w:pPr>
+              <w:spacing w:before="0" w:after="60" w:line="340"/>
+              <w:jc w:val="both"/>
+            </w:pPr>
+            <w:r>
+              <w:rPr>
+                <w:rFonts w:ascii="Times New Roman" w:cs="Times New Roman" w:eastAsia="Times New Roman" w:hAnsi="Times New Roman"/>
+                <w:b w:val="false"/>
+                <w:bCs w:val="false"/>
+                <w:i w:val="false"/>
+                <w:iCs w:val="false"/>
+                <w:color w:val="111111"/>
+                <w:sz w:val="20"/>
+                <w:szCs w:val="20"/>
+              </w:rPr>
+              <w:t xml:space="preserve">Toute série absolument convergente est convergente dans ℝ.</w:t>
+            </w:r>
+          </w:p>
+        </w:tc>
+      </w:tr>
+    </w:tbl>
+    <w:p>
+      <w:pPr>
+        <w:spacing w:before="80" w:after="0"/>
+      </w:pPr>
+    </w:p>
+    <w:p>
+      <w:pPr>
+        <w:spacing w:before="320" w:after="40"/>
+      </w:pPr>
+      <w:r>
+        <w:rPr>
+          <w:rFonts w:ascii="Courier New" w:cs="Courier New" w:eastAsia="Courier New" w:hAnsi="Courier New"/>
+          <w:b w:val="false"/>
+          <w:bCs w:val="false"/>
+          <w:i w:val="false"/>
+          <w:iCs w:val="false"/>
+          <w:color w:val="AAAAAA"/>
+          <w:sz w:val="16"/>
+          <w:szCs w:val="16"/>
+        </w:rPr>
+        <w:t xml:space="preserve">§ 2.2</w:t>
+      </w:r>
+    </w:p>
+    <w:p>
+      <w:pPr>
+        <w:pStyle w:val="Heading2"/>
+        <w:spacing w:before="360" w:after="120"/>
+        <w:outlineLvl w:val="1"/>
+      </w:pPr>
+      <w:r>
+        <w:rPr>
+          <w:rFonts w:ascii="Times New Roman" w:cs="Times New Roman" w:eastAsia="Times New Roman" w:hAnsi="Times New Roman"/>
+          <w:b/>
+          <w:bCs/>
+          <w:i w:val="false"/>
+          <w:iCs w:val="false"/>
+          <w:color w:val="111111"/>
+          <w:sz w:val="26"/>
+          <w:szCs w:val="26"/>
+        </w:rPr>
+        <w:t xml:space="preserve">Exemples et remarques</w:t>
+      </w:r>
+    </w:p>
+    <w:p>
+      <w:pPr>
+        <w:spacing w:before="160" w:after="0"/>
+      </w:pPr>
+    </w:p>
+    <w:tbl>
+      <w:tblPr>
+        <w:tblW w:type="dxa" w:w="9360"/>
+        <w:tblBorders>
+          <w:top w:val="none" w:color="FFFFFF" w:sz="0"/>
+          <w:left w:val="none" w:color="FFFFFF" w:sz="0"/>
+          <w:bottom w:val="none" w:color="FFFFFF" w:sz="0"/>
+          <w:right w:val="none" w:color="FFFFFF" w:sz="0"/>
+          <w:insideH w:val="single" w:color="auto" w:sz="4"/>
+          <w:insideV w:val="single" w:color="auto" w:sz="4"/>
+        </w:tblBorders>
+      </w:tblPr>
+      <w:tblGrid>
+        <w:gridCol w:w="9360"/>
+      </w:tblGrid>
+      <w:tr>
+        <w:tc>
+          <w:tcPr>
+            <w:tcW w:type="dxa" w:w="9260"/>
+            <w:tcBorders>
+              <w:top w:val="none" w:color="FFFFFF" w:sz="0"/>
+              <w:left w:val="single" w:color="CCCCCC" w:sz="2"/>
+              <w:bottom w:val="none" w:color="FFFFFF" w:sz="0"/>
+              <w:right w:val="none" w:color="FFFFFF" w:sz="0"/>
+            </w:tcBorders>
+            <w:shd w:fill="FFFFFF" w:val="clear"/>
+            <w:tcMar>
+              <w:top w:type="dxa" w:w="0"/>
+              <w:left w:type="dxa" w:w="160"/>
+              <w:bottom w:type="dxa" w:w="0"/>
+              <w:right w:type="dxa" w:w="100"/>
+            </w:tcMar>
+          </w:tcPr>
+          <w:p>
+            <w:pPr>
+              <w:spacing w:before="0" w:after="60"/>
+            </w:pPr>
+            <w:r>
+              <w:rPr>
+                <w:rFonts w:ascii="Times New Roman" w:cs="Times New Roman" w:eastAsia="Times New Roman" w:hAnsi="Times New Roman"/>
+                <w:b/>
+                <w:bCs/>
+                <w:i w:val="false"/>
+                <w:iCs w:val="false"/>
+                <w:color w:val="111111"/>
+                <w:sz w:val="20"/>
+                <w:szCs w:val="20"/>
+              </w:rPr>
+              <w:t xml:space="preserve">Exemple 2.1</w:t>
+            </w:r>
+            <w:r>
+              <w:rPr>
+                <w:rFonts w:ascii="Times New Roman" w:cs="Times New Roman" w:eastAsia="Times New Roman" w:hAnsi="Times New Roman"/>
+                <w:b w:val="false"/>
+                <w:bCs w:val="false"/>
+                <w:i/>
+                <w:iCs/>
+                <w:color w:val="111111"/>
+                <w:sz w:val="20"/>
+                <w:szCs w:val="20"/>
+              </w:rPr>
+              <w:t xml:space="preserve"> — Suite géométrique</w:t>
+            </w:r>
+            <w:r>
+              <w:rPr>
+                <w:rFonts w:ascii="Times New Roman" w:cs="Times New Roman" w:eastAsia="Times New Roman" w:hAnsi="Times New Roman"/>
+                <w:b/>
+                <w:bCs/>
+                <w:i w:val="false"/>
+                <w:iCs w:val="false"/>
+                <w:color w:val="111111"/>
+                <w:sz w:val="20"/>
+                <w:szCs w:val="20"/>
+              </w:rPr>
+              <w:t xml:space="preserve">.</w:t>
+            </w:r>
+            <w:r>
+              <w:rPr>
+                <w:rFonts w:ascii="Times New Roman" w:cs="Times New Roman" w:eastAsia="Times New Roman" w:hAnsi="Times New Roman"/>
+                <w:b w:val="false"/>
+                <w:bCs w:val="false"/>
+                <w:i w:val="false"/>
+                <w:iCs w:val="false"/>
+                <w:color w:val="111111"/>
+                <w:sz w:val="20"/>
+                <w:szCs w:val="20"/>
+              </w:rPr>
+              <w:t xml:space="preserve"> </w:t>
+            </w:r>
+          </w:p>
+        </w:tc>
+      </w:tr>
+      <w:tr>
+        <w:tc>
+          <w:tcPr>
+            <w:tcW w:type="dxa" w:w="9260"/>
+            <w:tcBorders>
+              <w:top w:val="none" w:color="FFFFFF" w:sz="0"/>
+              <w:left w:val="single" w:color="CCCCCC" w:sz="2"/>
+              <w:bottom w:val="none" w:color="FFFFFF" w:sz="0"/>
+              <w:right w:val="none" w:color="FFFFFF" w:sz="0"/>
+            </w:tcBorders>
+            <w:shd w:fill="FFFFFF" w:val="clear"/>
+            <w:tcMar>
+              <w:top w:type="dxa" w:w="0"/>
+              <w:left w:type="dxa" w:w="160"/>
+              <w:bottom w:type="dxa" w:w="0"/>
+              <w:right w:type="dxa" w:w="100"/>
+            </w:tcMar>
+          </w:tcPr>
+          <w:p>
+            <w:pPr>
+              <w:spacing w:before="0" w:after="60" w:line="340"/>
+              <w:jc w:val="both"/>
+            </w:pPr>
+            <w:r>
+              <w:rPr>
+                <w:rFonts w:ascii="Times New Roman" w:cs="Times New Roman" w:eastAsia="Times New Roman" w:hAnsi="Times New Roman"/>
+                <w:b w:val="false"/>
+                <w:bCs w:val="false"/>
+                <w:i w:val="false"/>
+                <w:iCs w:val="false"/>
+                <w:color w:val="111111"/>
+                <w:sz w:val="20"/>
+                <w:szCs w:val="20"/>
+              </w:rPr>
+              <w:t xml:space="preserve">La suite uₙ = rⁿ converge vers 0 si |r| &lt; 1, vers 1 si r = 1, et diverge sinon. Pour r = 0.9, on a u₁₀₀ ≈ 2.656 × 10⁻⁵.</w:t>
+            </w:r>
+          </w:p>
+        </w:tc>
+      </w:tr>
+    </w:tbl>
+    <w:p>
+      <w:pPr>
+        <w:spacing w:before="80" w:after="0"/>
+      </w:pPr>
+    </w:p>
+    <w:p>
+      <w:pPr>
+        <w:spacing w:before="160" w:after="0"/>
+      </w:pPr>
+    </w:p>
+    <w:tbl>
+      <w:tblPr>
+        <w:tblW w:type="dxa" w:w="9360"/>
+        <w:tblBorders>
+          <w:top w:val="none" w:color="FFFFFF" w:sz="0"/>
+          <w:left w:val="none" w:color="FFFFFF" w:sz="0"/>
+          <w:bottom w:val="none" w:color="FFFFFF" w:sz="0"/>
+          <w:right w:val="none" w:color="FFFFFF" w:sz="0"/>
+          <w:insideH w:val="single" w:color="auto" w:sz="4"/>
+          <w:insideV w:val="single" w:color="auto" w:sz="4"/>
+        </w:tblBorders>
+      </w:tblPr>
+      <w:tblGrid>
+        <w:gridCol w:w="9360"/>
+      </w:tblGrid>
+      <w:tr>
+        <w:tc>
+          <w:tcPr>
+            <w:tcW w:type="dxa" w:w="9260"/>
+            <w:tcBorders>
+              <w:top w:val="none" w:color="FFFFFF" w:sz="0"/>
+              <w:left w:val="single" w:color="CCCCCC" w:sz="2"/>
+              <w:bottom w:val="none" w:color="FFFFFF" w:sz="0"/>
+              <w:right w:val="none" w:color="FFFFFF" w:sz="0"/>
+            </w:tcBorders>
+            <w:shd w:fill="FFFFFF" w:val="clear"/>
+            <w:tcMar>
+              <w:top w:type="dxa" w:w="0"/>
+              <w:left w:type="dxa" w:w="160"/>
+              <w:bottom w:type="dxa" w:w="0"/>
+              <w:right w:type="dxa" w:w="100"/>
+            </w:tcMar>
+          </w:tcPr>
+          <w:p>
+            <w:pPr>
+              <w:spacing w:before="0" w:after="60"/>
+            </w:pPr>
+            <w:r>
+              <w:rPr>
+                <w:rFonts w:ascii="Times New Roman" w:cs="Times New Roman" w:eastAsia="Times New Roman" w:hAnsi="Times New Roman"/>
+                <w:b/>
+                <w:bCs/>
+                <w:i w:val="false"/>
+                <w:iCs w:val="false"/>
+                <w:color w:val="111111"/>
+                <w:sz w:val="20"/>
+                <w:szCs w:val="20"/>
+              </w:rPr>
+              <w:t xml:space="preserve">Exemple 2.2</w:t>
+            </w:r>
+            <w:r>
+              <w:rPr>
+                <w:rFonts w:ascii="Times New Roman" w:cs="Times New Roman" w:eastAsia="Times New Roman" w:hAnsi="Times New Roman"/>
+                <w:b w:val="false"/>
+                <w:bCs w:val="false"/>
+                <w:i/>
+                <w:iCs/>
+                <w:color w:val="111111"/>
+                <w:sz w:val="20"/>
+                <w:szCs w:val="20"/>
+              </w:rPr>
+              <w:t xml:space="preserve"> — Algorithme KMP</w:t>
+            </w:r>
+            <w:r>
+              <w:rPr>
+                <w:rFonts w:ascii="Times New Roman" w:cs="Times New Roman" w:eastAsia="Times New Roman" w:hAnsi="Times New Roman"/>
+                <w:b/>
+                <w:bCs/>
+                <w:i w:val="false"/>
+                <w:iCs w:val="false"/>
+                <w:color w:val="111111"/>
+                <w:sz w:val="20"/>
+                <w:szCs w:val="20"/>
+              </w:rPr>
+              <w:t xml:space="preserve">.</w:t>
+            </w:r>
+            <w:r>
+              <w:rPr>
+                <w:rFonts w:ascii="Times New Roman" w:cs="Times New Roman" w:eastAsia="Times New Roman" w:hAnsi="Times New Roman"/>
+                <w:b w:val="false"/>
+                <w:bCs w:val="false"/>
+                <w:i w:val="false"/>
+                <w:iCs w:val="false"/>
+                <w:color w:val="111111"/>
+                <w:sz w:val="20"/>
+                <w:szCs w:val="20"/>
+              </w:rPr>
+              <w:t xml:space="preserve"> </w:t>
+            </w:r>
+          </w:p>
+        </w:tc>
+      </w:tr>
+      <w:tr>
+        <w:tc>
+          <w:tcPr>
+            <w:tcW w:type="dxa" w:w="9260"/>
+            <w:tcBorders>
+              <w:top w:val="none" w:color="FFFFFF" w:sz="0"/>
+              <w:left w:val="single" w:color="CCCCCC" w:sz="2"/>
+              <w:bottom w:val="none" w:color="FFFFFF" w:sz="0"/>
+              <w:right w:val="none" w:color="FFFFFF" w:sz="0"/>
+            </w:tcBorders>
+            <w:shd w:fill="FFFFFF" w:val="clear"/>
+            <w:tcMar>
+              <w:top w:type="dxa" w:w="0"/>
+              <w:left w:type="dxa" w:w="160"/>
+              <w:bottom w:type="dxa" w:w="0"/>
+              <w:right w:type="dxa" w:w="100"/>
+            </w:tcMar>
+          </w:tcPr>
+          <w:p>
+            <w:pPr>
+              <w:spacing w:before="0" w:after="60" w:line="340"/>
+              <w:jc w:val="both"/>
+            </w:pPr>
+            <w:r>
+              <w:rPr>
+                <w:rFonts w:ascii="Times New Roman" w:cs="Times New Roman" w:eastAsia="Times New Roman" w:hAnsi="Times New Roman"/>
+                <w:b w:val="false"/>
+                <w:bCs w:val="false"/>
+                <w:i w:val="false"/>
+                <w:iCs w:val="false"/>
+                <w:color w:val="111111"/>
+                <w:sz w:val="20"/>
+                <w:szCs w:val="20"/>
+              </w:rPr>
+              <w:t xml:space="preserve">L'algorithme de Knuth–Morris–Pratt recherche un motif de longueur m dans un texte de longueur n en O(n + m), en prétraitant le tableau lps (longest proper prefix-suffix) du motif.</w:t>
+            </w:r>
+          </w:p>
+        </w:tc>
+      </w:tr>
+    </w:tbl>
+    <w:p>
+      <w:pPr>
+        <w:spacing w:before="80" w:after="0"/>
+      </w:pPr>
+    </w:p>
+    <w:p>
+      <w:pPr>
+        <w:spacing w:before="160" w:after="0"/>
+      </w:pPr>
+    </w:p>
+    <w:tbl>
+      <w:tblPr>
+        <w:tblW w:type="dxa" w:w="9360"/>
+        <w:tblBorders>
+          <w:top w:val="none" w:color="FFFFFF" w:sz="0"/>
+          <w:left w:val="none" w:color="FFFFFF" w:sz="0"/>
+          <w:bottom w:val="none" w:color="FFFFFF" w:sz="0"/>
+          <w:right w:val="none" w:color="FFFFFF" w:sz="0"/>
+          <w:insideH w:val="single" w:color="auto" w:sz="4"/>
+          <w:insideV w:val="single" w:color="auto" w:sz="4"/>
+        </w:tblBorders>
+      </w:tblPr>
+      <w:tblGrid>
+        <w:gridCol w:w="9360"/>
+      </w:tblGrid>
+      <w:tr>
+        <w:tc>
+          <w:tcPr>
+            <w:tcW w:type="dxa" w:w="9260"/>
+            <w:tcBorders>
+              <w:top w:val="none" w:color="FFFFFF" w:sz="0"/>
+              <w:left w:val="single" w:color="CCCCCC" w:sz="2"/>
+              <w:bottom w:val="none" w:color="FFFFFF" w:sz="0"/>
+              <w:right w:val="none" w:color="FFFFFF" w:sz="0"/>
+            </w:tcBorders>
+            <w:shd w:fill="FFFFFF" w:val="clear"/>
+            <w:tcMar>
+              <w:top w:type="dxa" w:w="0"/>
+              <w:left w:type="dxa" w:w="160"/>
+              <w:bottom w:type="dxa" w:w="0"/>
+              <w:right w:type="dxa" w:w="100"/>
+            </w:tcMar>
+          </w:tcPr>
+          <w:p>
+            <w:pPr>
+              <w:spacing w:before="0" w:after="60"/>
+            </w:pPr>
+            <w:r>
+              <w:rPr>
+                <w:rFonts w:ascii="Times New Roman" w:cs="Times New Roman" w:eastAsia="Times New Roman" w:hAnsi="Times New Roman"/>
+                <w:b/>
+                <w:bCs/>
+                <w:i w:val="false"/>
+                <w:iCs w:val="false"/>
+                <w:color w:val="111111"/>
+                <w:sz w:val="20"/>
+                <w:szCs w:val="20"/>
+              </w:rPr>
+              <w:t xml:space="preserve">Remarque 2.3</w:t>
+            </w:r>
+            <w:r>
+              <w:rPr>
+                <w:rFonts w:ascii="Times New Roman" w:cs="Times New Roman" w:eastAsia="Times New Roman" w:hAnsi="Times New Roman"/>
+                <w:b/>
+                <w:bCs/>
+                <w:i w:val="false"/>
+                <w:iCs w:val="false"/>
+                <w:color w:val="111111"/>
+                <w:sz w:val="20"/>
+                <w:szCs w:val="20"/>
+              </w:rPr>
+              <w:t xml:space="preserve">.</w:t>
+            </w:r>
+            <w:r>
+              <w:rPr>
+                <w:rFonts w:ascii="Times New Roman" w:cs="Times New Roman" w:eastAsia="Times New Roman" w:hAnsi="Times New Roman"/>
+                <w:b w:val="false"/>
+                <w:bCs w:val="false"/>
+                <w:i w:val="false"/>
+                <w:iCs w:val="false"/>
+                <w:color w:val="111111"/>
+                <w:sz w:val="20"/>
+                <w:szCs w:val="20"/>
+              </w:rPr>
+              <w:t xml:space="preserve"> </w:t>
+            </w:r>
+          </w:p>
+        </w:tc>
+      </w:tr>
+      <w:tr>
+        <w:tc>
+          <w:tcPr>
+            <w:tcW w:type="dxa" w:w="9260"/>
+            <w:tcBorders>
+              <w:top w:val="none" w:color="FFFFFF" w:sz="0"/>
+              <w:left w:val="single" w:color="CCCCCC" w:sz="2"/>
+              <w:bottom w:val="none" w:color="FFFFFF" w:sz="0"/>
+              <w:right w:val="none" w:color="FFFFFF" w:sz="0"/>
+            </w:tcBorders>
+            <w:shd w:fill="FFFFFF" w:val="clear"/>
+            <w:tcMar>
+              <w:top w:type="dxa" w:w="0"/>
+              <w:left w:type="dxa" w:w="160"/>
+              <w:bottom w:type="dxa" w:w="0"/>
+              <w:right w:type="dxa" w:w="100"/>
+            </w:tcMar>
+          </w:tcPr>
+          <w:p>
+            <w:pPr>
+              <w:spacing w:before="0" w:after="60" w:line="340"/>
+              <w:jc w:val="both"/>
+            </w:pPr>
+            <w:r>
+              <w:rPr>
+                <w:rFonts w:ascii="Times New Roman" w:cs="Times New Roman" w:eastAsia="Times New Roman" w:hAnsi="Times New Roman"/>
+                <w:b w:val="false"/>
+                <w:bCs w:val="false"/>
+                <w:i/>
+                <w:iCs/>
+                <w:color w:val="111111"/>
+                <w:sz w:val="20"/>
+                <w:szCs w:val="20"/>
+              </w:rPr>
+              <w:t xml:space="preserve">La convergence uniforme implique la convergence simple, mais la réciproque est fausse. La suite fₙ(x) = xⁿ sur [0,1] converge simplement mais non uniformément.</w:t>
+            </w:r>
+          </w:p>
+        </w:tc>
+      </w:tr>
+    </w:tbl>
+    <w:p>
+      <w:pPr>
+        <w:spacing w:before="80" w:after="0"/>
+      </w:pPr>
+    </w:p>
+    <w:p>
+      <w:r>
+        <w:br w:type="page"/>
+      </w:r>
+    </w:p>
+    <w:p>
+      <w:pPr>
+        <w:spacing w:before="320" w:after="40"/>
+      </w:pPr>
+      <w:r>
+        <w:rPr>
+          <w:rFonts w:ascii="Courier New" w:cs="Courier New" w:eastAsia="Courier New" w:hAnsi="Courier New"/>
+          <w:b w:val="false"/>
+          <w:bCs w:val="false"/>
+          <w:i w:val="false"/>
+          <w:iCs w:val="false"/>
+          <w:color w:val="AAAAAA"/>
+          <w:sz w:val="16"/>
+          <w:szCs w:val="16"/>
+        </w:rPr>
+        <w:t xml:space="preserve">§ 3</w:t>
+      </w:r>
+    </w:p>
+    <w:p>
+      <w:pPr>
+        <w:pStyle w:val="Heading1"/>
+        <w:spacing w:before="120" w:after="200"/>
+        <w:outlineLvl w:val="0"/>
+      </w:pPr>
+      <w:r>
+        <w:rPr>
+          <w:rFonts w:ascii="Times New Roman" w:cs="Times New Roman" w:eastAsia="Times New Roman" w:hAnsi="Times New Roman"/>
+          <w:b/>
+          <w:bCs/>
+          <w:i w:val="false"/>
+          <w:iCs w:val="false"/>
           <w:color w:val="111111"/>
           <w:sz w:val="34"/>
           <w:szCs w:val="34"/>
         </w:rPr>
-        <w:t xml:space="preserve">Données et tableaux</w:t>
+        <w:t xml:space="preserve">Exercices et corrections</w:t>
+      </w:r>
+    </w:p>
+    <w:p>
+      <w:pPr>
+        <w:pBdr>
+          <w:bottom w:val="single" w:color="CCCCCC" w:sz="2" w:space="4"/>
+        </w:pBdr>
+        <w:spacing w:before="80" w:after="80"/>
+      </w:pPr>
+    </w:p>
+    <w:p>
+      <w:pPr>
+        <w:spacing w:before="160" w:after="0"/>
+      </w:pPr>
+    </w:p>
+    <w:tbl>
+      <w:tblPr>
+        <w:tblW w:type="dxa" w:w="9360"/>
+        <w:tblBorders>
+          <w:top w:val="single" w:color="111111" w:sz="2"/>
+          <w:left w:val="single" w:color="111111" w:sz="2"/>
+          <w:bottom w:val="single" w:color="111111" w:sz="2"/>
+          <w:right w:val="single" w:color="111111" w:sz="2"/>
+          <w:insideH w:val="single" w:color="auto" w:sz="4"/>
+          <w:insideV w:val="single" w:color="auto" w:sz="4"/>
+        </w:tblBorders>
+      </w:tblPr>
+      <w:tblGrid>
+        <w:gridCol w:w="9360"/>
+      </w:tblGrid>
+      <w:tr>
+        <w:tc>
+          <w:tcPr>
+            <w:tcW w:type="dxa" w:w="9260"/>
+            <w:tcBorders>
+              <w:top w:val="none" w:color="FFFFFF" w:sz="0"/>
+              <w:left w:val="none" w:color="FFFFFF" w:sz="0"/>
+              <w:bottom w:val="none" w:color="FFFFFF" w:sz="0"/>
+              <w:right w:val="none" w:color="FFFFFF" w:sz="0"/>
+            </w:tcBorders>
+            <w:shd w:fill="FFFFFF" w:val="clear"/>
+            <w:tcMar>
+              <w:top w:type="dxa" w:w="0"/>
+              <w:left w:type="dxa" w:w="100"/>
+              <w:bottom w:type="dxa" w:w="0"/>
+              <w:right w:type="dxa" w:w="100"/>
+            </w:tcMar>
+          </w:tcPr>
+          <w:p>
+            <w:pPr>
+              <w:spacing w:before="0" w:after="60"/>
+            </w:pPr>
+            <w:r>
+              <w:rPr>
+                <w:rFonts w:ascii="Times New Roman" w:cs="Times New Roman" w:eastAsia="Times New Roman" w:hAnsi="Times New Roman"/>
+                <w:b/>
+                <w:bCs/>
+                <w:i w:val="false"/>
+                <w:iCs w:val="false"/>
+                <w:color w:val="111111"/>
+                <w:sz w:val="20"/>
+                <w:szCs w:val="20"/>
+              </w:rPr>
+              <w:t xml:space="preserve">Exercice 3.1</w:t>
+            </w:r>
+            <w:r>
+              <w:rPr>
+                <w:rFonts w:ascii="Times New Roman" w:cs="Times New Roman" w:eastAsia="Times New Roman" w:hAnsi="Times New Roman"/>
+                <w:b w:val="false"/>
+                <w:bCs w:val="false"/>
+                <w:i/>
+                <w:iCs/>
+                <w:color w:val="111111"/>
+                <w:sz w:val="20"/>
+                <w:szCs w:val="20"/>
+              </w:rPr>
+              <w:t xml:space="preserve"> — Convergence uniforme</w:t>
+            </w:r>
+            <w:r>
+              <w:rPr>
+                <w:rFonts w:ascii="Times New Roman" w:cs="Times New Roman" w:eastAsia="Times New Roman" w:hAnsi="Times New Roman"/>
+                <w:b/>
+                <w:bCs/>
+                <w:i w:val="false"/>
+                <w:iCs w:val="false"/>
+                <w:color w:val="111111"/>
+                <w:sz w:val="20"/>
+                <w:szCs w:val="20"/>
+              </w:rPr>
+              <w:t xml:space="preserve">.</w:t>
+            </w:r>
+            <w:r>
+              <w:rPr>
+                <w:rFonts w:ascii="Times New Roman" w:cs="Times New Roman" w:eastAsia="Times New Roman" w:hAnsi="Times New Roman"/>
+                <w:b w:val="false"/>
+                <w:bCs w:val="false"/>
+                <w:i w:val="false"/>
+                <w:iCs w:val="false"/>
+                <w:color w:val="111111"/>
+                <w:sz w:val="20"/>
+                <w:szCs w:val="20"/>
+              </w:rPr>
+              <w:t xml:space="preserve"> </w:t>
+            </w:r>
+          </w:p>
+        </w:tc>
+      </w:tr>
+      <w:tr>
+        <w:tc>
+          <w:tcPr>
+            <w:tcW w:type="dxa" w:w="9260"/>
+            <w:tcBorders>
+              <w:top w:val="none" w:color="FFFFFF" w:sz="0"/>
+              <w:left w:val="none" w:color="FFFFFF" w:sz="0"/>
+              <w:bottom w:val="none" w:color="FFFFFF" w:sz="0"/>
+              <w:right w:val="none" w:color="FFFFFF" w:sz="0"/>
+            </w:tcBorders>
+            <w:shd w:fill="FFFFFF" w:val="clear"/>
+            <w:tcMar>
+              <w:top w:type="dxa" w:w="0"/>
+              <w:left w:type="dxa" w:w="100"/>
+              <w:bottom w:type="dxa" w:w="0"/>
+              <w:right w:type="dxa" w:w="100"/>
+            </w:tcMar>
+          </w:tcPr>
+          <w:p>
+            <w:pPr>
+              <w:spacing w:before="0" w:after="60" w:line="340"/>
+              <w:jc w:val="both"/>
+            </w:pPr>
+            <w:r>
+              <w:rPr>
+                <w:rFonts w:ascii="Times New Roman" w:cs="Times New Roman" w:eastAsia="Times New Roman" w:hAnsi="Times New Roman"/>
+                <w:b w:val="false"/>
+                <w:bCs w:val="false"/>
+                <w:i w:val="false"/>
+                <w:iCs w:val="false"/>
+                <w:color w:val="111111"/>
+                <w:sz w:val="20"/>
+                <w:szCs w:val="20"/>
+              </w:rPr>
+              <w:t xml:space="preserve">Montrer que la suite fₙ(x) = x / (1 + nx²) converge uniformément vers 0 sur ℝ.</w:t>
+            </w:r>
+          </w:p>
+        </w:tc>
+      </w:tr>
+    </w:tbl>
+    <w:p>
+      <w:pPr>
+        <w:spacing w:before="80" w:after="0"/>
+      </w:pPr>
+    </w:p>
+    <w:p>
+      <w:pPr>
+        <w:spacing w:before="160" w:after="0"/>
+      </w:pPr>
+    </w:p>
+    <w:tbl>
+      <w:tblPr>
+        <w:tblW w:type="dxa" w:w="9360"/>
+        <w:tblBorders>
+          <w:top w:val="none" w:color="FFFFFF" w:sz="0"/>
+          <w:left w:val="none" w:color="FFFFFF" w:sz="0"/>
+          <w:bottom w:val="none" w:color="FFFFFF" w:sz="0"/>
+          <w:right w:val="none" w:color="FFFFFF" w:sz="0"/>
+          <w:insideH w:val="single" w:color="auto" w:sz="4"/>
+          <w:insideV w:val="single" w:color="auto" w:sz="4"/>
+        </w:tblBorders>
+      </w:tblPr>
+      <w:tblGrid>
+        <w:gridCol w:w="9360"/>
+      </w:tblGrid>
+      <w:tr>
+        <w:tc>
+          <w:tcPr>
+            <w:tcW w:type="dxa" w:w="9260"/>
+            <w:tcBorders>
+              <w:top w:val="none" w:color="FFFFFF" w:sz="0"/>
+              <w:left w:val="single" w:color="CCCCCC" w:sz="2"/>
+              <w:bottom w:val="none" w:color="FFFFFF" w:sz="0"/>
+              <w:right w:val="none" w:color="FFFFFF" w:sz="0"/>
+            </w:tcBorders>
+            <w:shd w:fill="FFFFFF" w:val="clear"/>
+            <w:tcMar>
+              <w:top w:type="dxa" w:w="0"/>
+              <w:left w:type="dxa" w:w="160"/>
+              <w:bottom w:type="dxa" w:w="0"/>
+              <w:right w:type="dxa" w:w="100"/>
+            </w:tcMar>
+          </w:tcPr>
+          <w:p>
+            <w:pPr>
+              <w:spacing w:before="0" w:after="60"/>
+            </w:pPr>
+            <w:r>
+              <w:rPr>
+                <w:rFonts w:ascii="Times New Roman" w:cs="Times New Roman" w:eastAsia="Times New Roman" w:hAnsi="Times New Roman"/>
+                <w:b/>
+                <w:bCs/>
+                <w:i w:val="false"/>
+                <w:iCs w:val="false"/>
+                <w:color w:val="111111"/>
+                <w:sz w:val="20"/>
+                <w:szCs w:val="20"/>
+              </w:rPr>
+              <w:t xml:space="preserve">Correction 3.1</w:t>
+            </w:r>
+            <w:r>
+              <w:rPr>
+                <w:rFonts w:ascii="Times New Roman" w:cs="Times New Roman" w:eastAsia="Times New Roman" w:hAnsi="Times New Roman"/>
+                <w:b/>
+                <w:bCs/>
+                <w:i w:val="false"/>
+                <w:iCs w:val="false"/>
+                <w:color w:val="111111"/>
+                <w:sz w:val="20"/>
+                <w:szCs w:val="20"/>
+              </w:rPr>
+              <w:t xml:space="preserve">.</w:t>
+            </w:r>
+            <w:r>
+              <w:rPr>
+                <w:rFonts w:ascii="Times New Roman" w:cs="Times New Roman" w:eastAsia="Times New Roman" w:hAnsi="Times New Roman"/>
+                <w:b w:val="false"/>
+                <w:bCs w:val="false"/>
+                <w:i w:val="false"/>
+                <w:iCs w:val="false"/>
+                <w:color w:val="111111"/>
+                <w:sz w:val="20"/>
+                <w:szCs w:val="20"/>
+              </w:rPr>
+              <w:t xml:space="preserve"> </w:t>
+            </w:r>
+          </w:p>
+        </w:tc>
+      </w:tr>
+      <w:tr>
+        <w:tc>
+          <w:tcPr>
+            <w:tcW w:type="dxa" w:w="9260"/>
+            <w:tcBorders>
+              <w:top w:val="none" w:color="FFFFFF" w:sz="0"/>
+              <w:left w:val="single" w:color="CCCCCC" w:sz="2"/>
+              <w:bottom w:val="none" w:color="FFFFFF" w:sz="0"/>
+              <w:right w:val="none" w:color="FFFFFF" w:sz="0"/>
+            </w:tcBorders>
+            <w:shd w:fill="FFFFFF" w:val="clear"/>
+            <w:tcMar>
+              <w:top w:type="dxa" w:w="0"/>
+              <w:left w:type="dxa" w:w="160"/>
+              <w:bottom w:type="dxa" w:w="0"/>
+              <w:right w:type="dxa" w:w="100"/>
+            </w:tcMar>
+          </w:tcPr>
+          <w:p>
+            <w:pPr>
+              <w:spacing w:before="0" w:after="60" w:line="340"/>
+              <w:jc w:val="both"/>
+            </w:pPr>
+            <w:r>
+              <w:rPr>
+                <w:rFonts w:ascii="Times New Roman" w:cs="Times New Roman" w:eastAsia="Times New Roman" w:hAnsi="Times New Roman"/>
+                <w:b w:val="false"/>
+                <w:bCs w:val="false"/>
+                <w:i/>
+                <w:iCs/>
+                <w:color w:val="111111"/>
+                <w:sz w:val="20"/>
+                <w:szCs w:val="20"/>
+              </w:rPr>
+              <w:t xml:space="preserve">Par l'inégalité AM-GM, 1 + nx² ≥ 2√n |x|, donc |fₙ(x)| ≤ 1/(2√n) → 0 uniformément.</w:t>
+            </w:r>
+          </w:p>
+        </w:tc>
+      </w:tr>
+    </w:tbl>
+    <w:p>
+      <w:pPr>
+        <w:spacing w:before="80" w:after="0"/>
+      </w:pPr>
+    </w:p>
+    <w:p>
+      <w:pPr>
+        <w:spacing w:before="160" w:after="0"/>
+      </w:pPr>
+    </w:p>
+    <w:tbl>
+      <w:tblPr>
+        <w:tblW w:type="dxa" w:w="9360"/>
+        <w:tblBorders>
+          <w:top w:val="single" w:color="111111" w:sz="2"/>
+          <w:left w:val="single" w:color="111111" w:sz="2"/>
+          <w:bottom w:val="single" w:color="111111" w:sz="2"/>
+          <w:right w:val="single" w:color="111111" w:sz="2"/>
+          <w:insideH w:val="single" w:color="auto" w:sz="4"/>
+          <w:insideV w:val="single" w:color="auto" w:sz="4"/>
+        </w:tblBorders>
+      </w:tblPr>
+      <w:tblGrid>
+        <w:gridCol w:w="9360"/>
+      </w:tblGrid>
+      <w:tr>
+        <w:tc>
+          <w:tcPr>
+            <w:tcW w:type="dxa" w:w="9260"/>
+            <w:tcBorders>
+              <w:top w:val="none" w:color="FFFFFF" w:sz="0"/>
+              <w:left w:val="none" w:color="FFFFFF" w:sz="0"/>
+              <w:bottom w:val="none" w:color="FFFFFF" w:sz="0"/>
+              <w:right w:val="none" w:color="FFFFFF" w:sz="0"/>
+            </w:tcBorders>
+            <w:shd w:fill="FFFFFF" w:val="clear"/>
+            <w:tcMar>
+              <w:top w:type="dxa" w:w="0"/>
+              <w:left w:type="dxa" w:w="100"/>
+              <w:bottom w:type="dxa" w:w="0"/>
+              <w:right w:type="dxa" w:w="100"/>
+            </w:tcMar>
+          </w:tcPr>
+          <w:p>
+            <w:pPr>
+              <w:spacing w:before="0" w:after="60"/>
+            </w:pPr>
+            <w:r>
+              <w:rPr>
+                <w:rFonts w:ascii="Times New Roman" w:cs="Times New Roman" w:eastAsia="Times New Roman" w:hAnsi="Times New Roman"/>
+                <w:b/>
+                <w:bCs/>
+                <w:i w:val="false"/>
+                <w:iCs w:val="false"/>
+                <w:color w:val="111111"/>
+                <w:sz w:val="20"/>
+                <w:szCs w:val="20"/>
+              </w:rPr>
+              <w:t xml:space="preserve">Exercice 3.2</w:t>
+            </w:r>
+            <w:r>
+              <w:rPr>
+                <w:rFonts w:ascii="Times New Roman" w:cs="Times New Roman" w:eastAsia="Times New Roman" w:hAnsi="Times New Roman"/>
+                <w:b w:val="false"/>
+                <w:bCs w:val="false"/>
+                <w:i/>
+                <w:iCs/>
+                <w:color w:val="111111"/>
+                <w:sz w:val="20"/>
+                <w:szCs w:val="20"/>
+              </w:rPr>
+              <w:t xml:space="preserve"> — Tri par fusion</w:t>
+            </w:r>
+            <w:r>
+              <w:rPr>
+                <w:rFonts w:ascii="Times New Roman" w:cs="Times New Roman" w:eastAsia="Times New Roman" w:hAnsi="Times New Roman"/>
+                <w:b/>
+                <w:bCs/>
+                <w:i w:val="false"/>
+                <w:iCs w:val="false"/>
+                <w:color w:val="111111"/>
+                <w:sz w:val="20"/>
+                <w:szCs w:val="20"/>
+              </w:rPr>
+              <w:t xml:space="preserve">.</w:t>
+            </w:r>
+            <w:r>
+              <w:rPr>
+                <w:rFonts w:ascii="Times New Roman" w:cs="Times New Roman" w:eastAsia="Times New Roman" w:hAnsi="Times New Roman"/>
+                <w:b w:val="false"/>
+                <w:bCs w:val="false"/>
+                <w:i w:val="false"/>
+                <w:iCs w:val="false"/>
+                <w:color w:val="111111"/>
+                <w:sz w:val="20"/>
+                <w:szCs w:val="20"/>
+              </w:rPr>
+              <w:t xml:space="preserve"> </w:t>
+            </w:r>
+          </w:p>
+        </w:tc>
+      </w:tr>
+      <w:tr>
+        <w:tc>
+          <w:tcPr>
+            <w:tcW w:type="dxa" w:w="9260"/>
+            <w:tcBorders>
+              <w:top w:val="none" w:color="FFFFFF" w:sz="0"/>
+              <w:left w:val="none" w:color="FFFFFF" w:sz="0"/>
+              <w:bottom w:val="none" w:color="FFFFFF" w:sz="0"/>
+              <w:right w:val="none" w:color="FFFFFF" w:sz="0"/>
+            </w:tcBorders>
+            <w:shd w:fill="FFFFFF" w:val="clear"/>
+            <w:tcMar>
+              <w:top w:type="dxa" w:w="0"/>
+              <w:left w:type="dxa" w:w="100"/>
+              <w:bottom w:type="dxa" w:w="0"/>
+              <w:right w:type="dxa" w:w="100"/>
+            </w:tcMar>
+          </w:tcPr>
+          <w:p>
+            <w:pPr>
+              <w:spacing w:before="0" w:after="60" w:line="340"/>
+              <w:jc w:val="both"/>
+            </w:pPr>
+            <w:r>
+              <w:rPr>
+                <w:rFonts w:ascii="Times New Roman" w:cs="Times New Roman" w:eastAsia="Times New Roman" w:hAnsi="Times New Roman"/>
+                <w:b w:val="false"/>
+                <w:bCs w:val="false"/>
+                <w:i w:val="false"/>
+                <w:iCs w:val="false"/>
+                <w:color w:val="111111"/>
+                <w:sz w:val="20"/>
+                <w:szCs w:val="20"/>
+              </w:rPr>
+              <w:t xml:space="preserve">Établir la récurrence T(n) = 2T(n/2) + Θ(n) du tri par fusion et en déduire T(n) = Θ(n log n) par le théorème maître.</w:t>
+            </w:r>
+          </w:p>
+        </w:tc>
+      </w:tr>
+    </w:tbl>
+    <w:p>
+      <w:pPr>
+        <w:spacing w:before="80" w:after="0"/>
+      </w:pPr>
+    </w:p>
+    <w:p>
+      <w:pPr>
+        <w:spacing w:before="160" w:after="0"/>
+      </w:pPr>
+    </w:p>
+    <w:tbl>
+      <w:tblPr>
+        <w:tblW w:type="dxa" w:w="9360"/>
+        <w:tblBorders>
+          <w:top w:val="none" w:color="FFFFFF" w:sz="0"/>
+          <w:left w:val="none" w:color="FFFFFF" w:sz="0"/>
+          <w:bottom w:val="none" w:color="FFFFFF" w:sz="0"/>
+          <w:right w:val="none" w:color="FFFFFF" w:sz="0"/>
+          <w:insideH w:val="single" w:color="auto" w:sz="4"/>
+          <w:insideV w:val="single" w:color="auto" w:sz="4"/>
+        </w:tblBorders>
+      </w:tblPr>
+      <w:tblGrid>
+        <w:gridCol w:w="9360"/>
+      </w:tblGrid>
+      <w:tr>
+        <w:tc>
+          <w:tcPr>
+            <w:tcW w:type="dxa" w:w="9260"/>
+            <w:tcBorders>
+              <w:top w:val="none" w:color="FFFFFF" w:sz="0"/>
+              <w:left w:val="single" w:color="CCCCCC" w:sz="2"/>
+              <w:bottom w:val="none" w:color="FFFFFF" w:sz="0"/>
+              <w:right w:val="none" w:color="FFFFFF" w:sz="0"/>
+            </w:tcBorders>
+            <w:shd w:fill="FFFFFF" w:val="clear"/>
+            <w:tcMar>
+              <w:top w:type="dxa" w:w="0"/>
+              <w:left w:type="dxa" w:w="160"/>
+              <w:bottom w:type="dxa" w:w="0"/>
+              <w:right w:type="dxa" w:w="100"/>
+            </w:tcMar>
+          </w:tcPr>
+          <w:p>
+            <w:pPr>
+              <w:spacing w:before="0" w:after="60"/>
+            </w:pPr>
+            <w:r>
+              <w:rPr>
+                <w:rFonts w:ascii="Times New Roman" w:cs="Times New Roman" w:eastAsia="Times New Roman" w:hAnsi="Times New Roman"/>
+                <w:b/>
+                <w:bCs/>
+                <w:i w:val="false"/>
+                <w:iCs w:val="false"/>
+                <w:color w:val="111111"/>
+                <w:sz w:val="20"/>
+                <w:szCs w:val="20"/>
+              </w:rPr>
+              <w:t xml:space="preserve">Correction 3.2</w:t>
+            </w:r>
+            <w:r>
+              <w:rPr>
+                <w:rFonts w:ascii="Times New Roman" w:cs="Times New Roman" w:eastAsia="Times New Roman" w:hAnsi="Times New Roman"/>
+                <w:b/>
+                <w:bCs/>
+                <w:i w:val="false"/>
+                <w:iCs w:val="false"/>
+                <w:color w:val="111111"/>
+                <w:sz w:val="20"/>
+                <w:szCs w:val="20"/>
+              </w:rPr>
+              <w:t xml:space="preserve">.</w:t>
+            </w:r>
+            <w:r>
+              <w:rPr>
+                <w:rFonts w:ascii="Times New Roman" w:cs="Times New Roman" w:eastAsia="Times New Roman" w:hAnsi="Times New Roman"/>
+                <w:b w:val="false"/>
+                <w:bCs w:val="false"/>
+                <w:i w:val="false"/>
+                <w:iCs w:val="false"/>
+                <w:color w:val="111111"/>
+                <w:sz w:val="20"/>
+                <w:szCs w:val="20"/>
+              </w:rPr>
+              <w:t xml:space="preserve"> </w:t>
+            </w:r>
+          </w:p>
+        </w:tc>
+      </w:tr>
+      <w:tr>
+        <w:tc>
+          <w:tcPr>
+            <w:tcW w:type="dxa" w:w="9260"/>
+            <w:tcBorders>
+              <w:top w:val="none" w:color="FFFFFF" w:sz="0"/>
+              <w:left w:val="single" w:color="CCCCCC" w:sz="2"/>
+              <w:bottom w:val="none" w:color="FFFFFF" w:sz="0"/>
+              <w:right w:val="none" w:color="FFFFFF" w:sz="0"/>
+            </w:tcBorders>
+            <w:shd w:fill="FFFFFF" w:val="clear"/>
+            <w:tcMar>
+              <w:top w:type="dxa" w:w="0"/>
+              <w:left w:type="dxa" w:w="160"/>
+              <w:bottom w:type="dxa" w:w="0"/>
+              <w:right w:type="dxa" w:w="100"/>
+            </w:tcMar>
+          </w:tcPr>
+          <w:p>
+            <w:pPr>
+              <w:spacing w:before="0" w:after="60" w:line="340"/>
+              <w:jc w:val="both"/>
+            </w:pPr>
+            <w:r>
+              <w:rPr>
+                <w:rFonts w:ascii="Times New Roman" w:cs="Times New Roman" w:eastAsia="Times New Roman" w:hAnsi="Times New Roman"/>
+                <w:b w:val="false"/>
+                <w:bCs w:val="false"/>
+                <w:i/>
+                <w:iCs/>
+                <w:color w:val="111111"/>
+                <w:sz w:val="20"/>
+                <w:szCs w:val="20"/>
+              </w:rPr>
+              <w:t xml:space="preserve">L'appel récursif sur deux moitiés donne 2T(n/2) ; la fusion coûte Θ(n). Le théorème maître (cas 2) donne directement T(n) = Θ(n log n).</w:t>
+            </w:r>
+          </w:p>
+        </w:tc>
+      </w:tr>
+    </w:tbl>
+    <w:p>
+      <w:pPr>
+        <w:spacing w:before="80" w:after="0"/>
+      </w:pPr>
+    </w:p>
+    <w:p>
+      <w:pPr>
+        <w:spacing w:before="160" w:after="0"/>
+      </w:pPr>
+    </w:p>
+    <w:tbl>
+      <w:tblPr>
+        <w:tblW w:type="dxa" w:w="9360"/>
+        <w:tblBorders>
+          <w:top w:val="single" w:color="111111" w:sz="2"/>
+          <w:left w:val="single" w:color="111111" w:sz="2"/>
+          <w:bottom w:val="single" w:color="111111" w:sz="2"/>
+          <w:right w:val="single" w:color="111111" w:sz="2"/>
+          <w:insideH w:val="single" w:color="auto" w:sz="4"/>
+          <w:insideV w:val="single" w:color="auto" w:sz="4"/>
+        </w:tblBorders>
+      </w:tblPr>
+      <w:tblGrid>
+        <w:gridCol w:w="9360"/>
+      </w:tblGrid>
+      <w:tr>
+        <w:tc>
+          <w:tcPr>
+            <w:tcW w:type="dxa" w:w="9260"/>
+            <w:tcBorders>
+              <w:top w:val="none" w:color="FFFFFF" w:sz="0"/>
+              <w:left w:val="none" w:color="FFFFFF" w:sz="0"/>
+              <w:bottom w:val="none" w:color="FFFFFF" w:sz="0"/>
+              <w:right w:val="none" w:color="FFFFFF" w:sz="0"/>
+            </w:tcBorders>
+            <w:shd w:fill="FFFFFF" w:val="clear"/>
+            <w:tcMar>
+              <w:top w:type="dxa" w:w="0"/>
+              <w:left w:type="dxa" w:w="100"/>
+              <w:bottom w:type="dxa" w:w="0"/>
+              <w:right w:type="dxa" w:w="100"/>
+            </w:tcMar>
+          </w:tcPr>
+          <w:p>
+            <w:pPr>
+              <w:spacing w:before="0" w:after="60"/>
+            </w:pPr>
+            <w:r>
+              <w:rPr>
+                <w:rFonts w:ascii="Times New Roman" w:cs="Times New Roman" w:eastAsia="Times New Roman" w:hAnsi="Times New Roman"/>
+                <w:b/>
+                <w:bCs/>
+                <w:i w:val="false"/>
+                <w:iCs w:val="false"/>
+                <w:color w:val="111111"/>
+                <w:sz w:val="20"/>
+                <w:szCs w:val="20"/>
+              </w:rPr>
+              <w:t xml:space="preserve">Exercice 3.3</w:t>
+            </w:r>
+            <w:r>
+              <w:rPr>
+                <w:rFonts w:ascii="Times New Roman" w:cs="Times New Roman" w:eastAsia="Times New Roman" w:hAnsi="Times New Roman"/>
+                <w:b w:val="false"/>
+                <w:bCs w:val="false"/>
+                <w:i/>
+                <w:iCs/>
+                <w:color w:val="111111"/>
+                <w:sz w:val="20"/>
+                <w:szCs w:val="20"/>
+              </w:rPr>
+              <w:t xml:space="preserve"> — Inégalité de Jensen</w:t>
+            </w:r>
+            <w:r>
+              <w:rPr>
+                <w:rFonts w:ascii="Times New Roman" w:cs="Times New Roman" w:eastAsia="Times New Roman" w:hAnsi="Times New Roman"/>
+                <w:b/>
+                <w:bCs/>
+                <w:i w:val="false"/>
+                <w:iCs w:val="false"/>
+                <w:color w:val="111111"/>
+                <w:sz w:val="20"/>
+                <w:szCs w:val="20"/>
+              </w:rPr>
+              <w:t xml:space="preserve">.</w:t>
+            </w:r>
+            <w:r>
+              <w:rPr>
+                <w:rFonts w:ascii="Times New Roman" w:cs="Times New Roman" w:eastAsia="Times New Roman" w:hAnsi="Times New Roman"/>
+                <w:b w:val="false"/>
+                <w:bCs w:val="false"/>
+                <w:i w:val="false"/>
+                <w:iCs w:val="false"/>
+                <w:color w:val="111111"/>
+                <w:sz w:val="20"/>
+                <w:szCs w:val="20"/>
+              </w:rPr>
+              <w:t xml:space="preserve"> </w:t>
+            </w:r>
+          </w:p>
+        </w:tc>
+      </w:tr>
+      <w:tr>
+        <w:tc>
+          <w:tcPr>
+            <w:tcW w:type="dxa" w:w="9260"/>
+            <w:tcBorders>
+              <w:top w:val="none" w:color="FFFFFF" w:sz="0"/>
+              <w:left w:val="none" w:color="FFFFFF" w:sz="0"/>
+              <w:bottom w:val="none" w:color="FFFFFF" w:sz="0"/>
+              <w:right w:val="none" w:color="FFFFFF" w:sz="0"/>
+            </w:tcBorders>
+            <w:shd w:fill="FFFFFF" w:val="clear"/>
+            <w:tcMar>
+              <w:top w:type="dxa" w:w="0"/>
+              <w:left w:type="dxa" w:w="100"/>
+              <w:bottom w:type="dxa" w:w="0"/>
+              <w:right w:type="dxa" w:w="100"/>
+            </w:tcMar>
+          </w:tcPr>
+          <w:p>
+            <w:pPr>
+              <w:spacing w:before="0" w:after="60" w:line="340"/>
+              <w:jc w:val="both"/>
+            </w:pPr>
+            <w:r>
+              <w:rPr>
+                <w:rFonts w:ascii="Times New Roman" w:cs="Times New Roman" w:eastAsia="Times New Roman" w:hAnsi="Times New Roman"/>
+                <w:b w:val="false"/>
+                <w:bCs w:val="false"/>
+                <w:i w:val="false"/>
+                <w:iCs w:val="false"/>
+                <w:color w:val="111111"/>
+                <w:sz w:val="20"/>
+                <w:szCs w:val="20"/>
+              </w:rPr>
+              <w:t xml:space="preserve">Soit φ : ℝ → ℝ convexe et X une variable aléatoire intégrable. Démontrer que φ(𝔼[X]) ≤ 𝔼[φ(X)].</w:t>
+            </w:r>
+          </w:p>
+        </w:tc>
+      </w:tr>
+    </w:tbl>
+    <w:p>
+      <w:pPr>
+        <w:spacing w:before="80" w:after="0"/>
+      </w:pPr>
+    </w:p>
+    <w:p>
+      <w:r>
+        <w:br w:type="page"/>
+      </w:r>
+    </w:p>
+    <w:p>
+      <w:pPr>
+        <w:spacing w:before="320" w:after="40"/>
+      </w:pPr>
+      <w:r>
+        <w:rPr>
+          <w:rFonts w:ascii="Courier New" w:cs="Courier New" w:eastAsia="Courier New" w:hAnsi="Courier New"/>
+          <w:b w:val="false"/>
+          <w:bCs w:val="false"/>
+          <w:i w:val="false"/>
+          <w:iCs w:val="false"/>
+          <w:color w:val="AAAAAA"/>
+          <w:sz w:val="16"/>
+          <w:szCs w:val="16"/>
+        </w:rPr>
+        <w:t xml:space="preserve">§ 4</w:t>
+      </w:r>
+    </w:p>
+    <w:p>
+      <w:pPr>
+        <w:pStyle w:val="Heading1"/>
+        <w:spacing w:before="120" w:after="200"/>
+        <w:outlineLvl w:val="0"/>
+      </w:pPr>
+      <w:r>
+        <w:rPr>
+          <w:rFonts w:ascii="Times New Roman" w:cs="Times New Roman" w:eastAsia="Times New Roman" w:hAnsi="Times New Roman"/>
+          <w:b/>
+          <w:bCs/>
+          <w:i w:val="false"/>
+          <w:iCs w:val="false"/>
+          <w:color w:val="111111"/>
+          <w:sz w:val="34"/>
+          <w:szCs w:val="34"/>
+        </w:rPr>
+        <w:t xml:space="preserve">Code et tableaux</w:t>
       </w:r>
     </w:p>
     <w:p>
@@ -369,12 +2355,393 @@
           <w:sz w:val="22"/>
           <w:szCs w:val="22"/>
         </w:rPr>
-        <w:t xml:space="preserve">Les tableaux suivent le modèle TAOCP : en-tête sur fond noir, corps alternant blanc et gris très léger, filets fins 0.25 pt.</w:t>
+        <w:t xml:space="preserve">Les blocs de code sont composés en Courier New 9 pt sur fond #F5F5F5 :</w:t>
       </w:r>
     </w:p>
     <w:p>
       <w:pPr>
-        <w:spacing w:before="0" w:after="120"/>
+        <w:spacing w:before="0" w:after="80"/>
+      </w:pPr>
+    </w:p>
+    <w:tbl>
+      <w:tblPr>
+        <w:tblW w:type="dxa" w:w="9360"/>
+        <w:tblBorders>
+          <w:top w:val="single" w:color="auto" w:sz="4"/>
+          <w:left w:val="single" w:color="auto" w:sz="4"/>
+          <w:bottom w:val="single" w:color="auto" w:sz="4"/>
+          <w:right w:val="single" w:color="auto" w:sz="4"/>
+          <w:insideH w:val="single" w:color="auto" w:sz="4"/>
+          <w:insideV w:val="single" w:color="auto" w:sz="4"/>
+        </w:tblBorders>
+      </w:tblPr>
+      <w:tblGrid>
+        <w:gridCol w:w="9360"/>
+      </w:tblGrid>
+      <w:tr>
+        <w:tc>
+          <w:tcPr>
+            <w:tcW w:type="dxa" w:w="9360"/>
+            <w:tcBorders>
+              <w:top w:val="single" w:color="DDDDDD" w:sz="2"/>
+              <w:left w:val="single" w:color="DDDDDD" w:sz="2"/>
+              <w:bottom w:val="single" w:color="DDDDDD" w:sz="2"/>
+              <w:right w:val="single" w:color="DDDDDD" w:sz="2"/>
+            </w:tcBorders>
+            <w:shd w:fill="F5F5F5" w:val="clear"/>
+            <w:tcMar>
+              <w:top w:type="dxa" w:w="0"/>
+              <w:left w:type="dxa" w:w="120"/>
+              <w:bottom w:type="dxa" w:w="0"/>
+              <w:right w:type="dxa" w:w="120"/>
+            </w:tcMar>
+          </w:tcPr>
+          <w:p>
+            <w:pPr>
+              <w:spacing w:before="0" w:after="0" w:line="276"/>
+            </w:pPr>
+            <w:r>
+              <w:rPr>
+                <w:rFonts w:ascii="Courier New" w:cs="Courier New" w:eastAsia="Courier New" w:hAnsi="Courier New"/>
+                <w:b w:val="false"/>
+                <w:bCs w:val="false"/>
+                <w:i w:val="false"/>
+                <w:iCs w:val="false"/>
+                <w:color w:val="111111"/>
+                <w:sz w:val="18"/>
+                <w:szCs w:val="18"/>
+              </w:rPr>
+              <w:t xml:space="preserve">def compute_lps(pattern):</w:t>
+            </w:r>
+          </w:p>
+        </w:tc>
+      </w:tr>
+      <w:tr>
+        <w:tc>
+          <w:tcPr>
+            <w:tcW w:type="dxa" w:w="9360"/>
+            <w:tcBorders>
+              <w:top w:val="single" w:color="DDDDDD" w:sz="2"/>
+              <w:left w:val="single" w:color="DDDDDD" w:sz="2"/>
+              <w:bottom w:val="single" w:color="DDDDDD" w:sz="2"/>
+              <w:right w:val="single" w:color="DDDDDD" w:sz="2"/>
+            </w:tcBorders>
+            <w:shd w:fill="F5F5F5" w:val="clear"/>
+            <w:tcMar>
+              <w:top w:type="dxa" w:w="0"/>
+              <w:left w:type="dxa" w:w="120"/>
+              <w:bottom w:type="dxa" w:w="0"/>
+              <w:right w:type="dxa" w:w="120"/>
+            </w:tcMar>
+          </w:tcPr>
+          <w:p>
+            <w:pPr>
+              <w:spacing w:before="0" w:after="0" w:line="276"/>
+            </w:pPr>
+            <w:r>
+              <w:rPr>
+                <w:rFonts w:ascii="Courier New" w:cs="Courier New" w:eastAsia="Courier New" w:hAnsi="Courier New"/>
+                <w:b w:val="false"/>
+                <w:bCs w:val="false"/>
+                <w:i w:val="false"/>
+                <w:iCs w:val="false"/>
+                <w:color w:val="111111"/>
+                <w:sz w:val="18"/>
+                <w:szCs w:val="18"/>
+              </w:rPr>
+              <w:t xml:space="preserve">    m, lps = len(pattern), [0] * len(pattern)</w:t>
+            </w:r>
+          </w:p>
+        </w:tc>
+      </w:tr>
+      <w:tr>
+        <w:tc>
+          <w:tcPr>
+            <w:tcW w:type="dxa" w:w="9360"/>
+            <w:tcBorders>
+              <w:top w:val="single" w:color="DDDDDD" w:sz="2"/>
+              <w:left w:val="single" w:color="DDDDDD" w:sz="2"/>
+              <w:bottom w:val="single" w:color="DDDDDD" w:sz="2"/>
+              <w:right w:val="single" w:color="DDDDDD" w:sz="2"/>
+            </w:tcBorders>
+            <w:shd w:fill="F5F5F5" w:val="clear"/>
+            <w:tcMar>
+              <w:top w:type="dxa" w:w="0"/>
+              <w:left w:type="dxa" w:w="120"/>
+              <w:bottom w:type="dxa" w:w="0"/>
+              <w:right w:type="dxa" w:w="120"/>
+            </w:tcMar>
+          </w:tcPr>
+          <w:p>
+            <w:pPr>
+              <w:spacing w:before="0" w:after="0" w:line="276"/>
+            </w:pPr>
+            <w:r>
+              <w:rPr>
+                <w:rFonts w:ascii="Courier New" w:cs="Courier New" w:eastAsia="Courier New" w:hAnsi="Courier New"/>
+                <w:b w:val="false"/>
+                <w:bCs w:val="false"/>
+                <w:i w:val="false"/>
+                <w:iCs w:val="false"/>
+                <w:color w:val="111111"/>
+                <w:sz w:val="18"/>
+                <w:szCs w:val="18"/>
+              </w:rPr>
+              <w:t xml:space="preserve">    length = 0; i = 1</w:t>
+            </w:r>
+          </w:p>
+        </w:tc>
+      </w:tr>
+      <w:tr>
+        <w:tc>
+          <w:tcPr>
+            <w:tcW w:type="dxa" w:w="9360"/>
+            <w:tcBorders>
+              <w:top w:val="single" w:color="DDDDDD" w:sz="2"/>
+              <w:left w:val="single" w:color="DDDDDD" w:sz="2"/>
+              <w:bottom w:val="single" w:color="DDDDDD" w:sz="2"/>
+              <w:right w:val="single" w:color="DDDDDD" w:sz="2"/>
+            </w:tcBorders>
+            <w:shd w:fill="F5F5F5" w:val="clear"/>
+            <w:tcMar>
+              <w:top w:type="dxa" w:w="0"/>
+              <w:left w:type="dxa" w:w="120"/>
+              <w:bottom w:type="dxa" w:w="0"/>
+              <w:right w:type="dxa" w:w="120"/>
+            </w:tcMar>
+          </w:tcPr>
+          <w:p>
+            <w:pPr>
+              <w:spacing w:before="0" w:after="0" w:line="276"/>
+            </w:pPr>
+            <w:r>
+              <w:rPr>
+                <w:rFonts w:ascii="Courier New" w:cs="Courier New" w:eastAsia="Courier New" w:hAnsi="Courier New"/>
+                <w:b w:val="false"/>
+                <w:bCs w:val="false"/>
+                <w:i w:val="false"/>
+                <w:iCs w:val="false"/>
+                <w:color w:val="111111"/>
+                <w:sz w:val="18"/>
+                <w:szCs w:val="18"/>
+              </w:rPr>
+              <w:t xml:space="preserve">    while i &lt; m:</w:t>
+            </w:r>
+          </w:p>
+        </w:tc>
+      </w:tr>
+      <w:tr>
+        <w:tc>
+          <w:tcPr>
+            <w:tcW w:type="dxa" w:w="9360"/>
+            <w:tcBorders>
+              <w:top w:val="single" w:color="DDDDDD" w:sz="2"/>
+              <w:left w:val="single" w:color="DDDDDD" w:sz="2"/>
+              <w:bottom w:val="single" w:color="DDDDDD" w:sz="2"/>
+              <w:right w:val="single" w:color="DDDDDD" w:sz="2"/>
+            </w:tcBorders>
+            <w:shd w:fill="F5F5F5" w:val="clear"/>
+            <w:tcMar>
+              <w:top w:type="dxa" w:w="0"/>
+              <w:left w:type="dxa" w:w="120"/>
+              <w:bottom w:type="dxa" w:w="0"/>
+              <w:right w:type="dxa" w:w="120"/>
+            </w:tcMar>
+          </w:tcPr>
+          <w:p>
+            <w:pPr>
+              <w:spacing w:before="0" w:after="0" w:line="276"/>
+            </w:pPr>
+            <w:r>
+              <w:rPr>
+                <w:rFonts w:ascii="Courier New" w:cs="Courier New" w:eastAsia="Courier New" w:hAnsi="Courier New"/>
+                <w:b w:val="false"/>
+                <w:bCs w:val="false"/>
+                <w:i w:val="false"/>
+                <w:iCs w:val="false"/>
+                <w:color w:val="111111"/>
+                <w:sz w:val="18"/>
+                <w:szCs w:val="18"/>
+              </w:rPr>
+              <w:t xml:space="preserve">        if pattern[i] == pattern[length]:</w:t>
+            </w:r>
+          </w:p>
+        </w:tc>
+      </w:tr>
+      <w:tr>
+        <w:tc>
+          <w:tcPr>
+            <w:tcW w:type="dxa" w:w="9360"/>
+            <w:tcBorders>
+              <w:top w:val="single" w:color="DDDDDD" w:sz="2"/>
+              <w:left w:val="single" w:color="DDDDDD" w:sz="2"/>
+              <w:bottom w:val="single" w:color="DDDDDD" w:sz="2"/>
+              <w:right w:val="single" w:color="DDDDDD" w:sz="2"/>
+            </w:tcBorders>
+            <w:shd w:fill="F5F5F5" w:val="clear"/>
+            <w:tcMar>
+              <w:top w:type="dxa" w:w="0"/>
+              <w:left w:type="dxa" w:w="120"/>
+              <w:bottom w:type="dxa" w:w="0"/>
+              <w:right w:type="dxa" w:w="120"/>
+            </w:tcMar>
+          </w:tcPr>
+          <w:p>
+            <w:pPr>
+              <w:spacing w:before="0" w:after="0" w:line="276"/>
+            </w:pPr>
+            <w:r>
+              <w:rPr>
+                <w:rFonts w:ascii="Courier New" w:cs="Courier New" w:eastAsia="Courier New" w:hAnsi="Courier New"/>
+                <w:b w:val="false"/>
+                <w:bCs w:val="false"/>
+                <w:i w:val="false"/>
+                <w:iCs w:val="false"/>
+                <w:color w:val="111111"/>
+                <w:sz w:val="18"/>
+                <w:szCs w:val="18"/>
+              </w:rPr>
+              <w:t xml:space="preserve">            length += 1; lps[i] = length; i += 1</w:t>
+            </w:r>
+          </w:p>
+        </w:tc>
+      </w:tr>
+      <w:tr>
+        <w:tc>
+          <w:tcPr>
+            <w:tcW w:type="dxa" w:w="9360"/>
+            <w:tcBorders>
+              <w:top w:val="single" w:color="DDDDDD" w:sz="2"/>
+              <w:left w:val="single" w:color="DDDDDD" w:sz="2"/>
+              <w:bottom w:val="single" w:color="DDDDDD" w:sz="2"/>
+              <w:right w:val="single" w:color="DDDDDD" w:sz="2"/>
+            </w:tcBorders>
+            <w:shd w:fill="F5F5F5" w:val="clear"/>
+            <w:tcMar>
+              <w:top w:type="dxa" w:w="0"/>
+              <w:left w:type="dxa" w:w="120"/>
+              <w:bottom w:type="dxa" w:w="0"/>
+              <w:right w:type="dxa" w:w="120"/>
+            </w:tcMar>
+          </w:tcPr>
+          <w:p>
+            <w:pPr>
+              <w:spacing w:before="0" w:after="0" w:line="276"/>
+            </w:pPr>
+            <w:r>
+              <w:rPr>
+                <w:rFonts w:ascii="Courier New" w:cs="Courier New" w:eastAsia="Courier New" w:hAnsi="Courier New"/>
+                <w:b w:val="false"/>
+                <w:bCs w:val="false"/>
+                <w:i w:val="false"/>
+                <w:iCs w:val="false"/>
+                <w:color w:val="111111"/>
+                <w:sz w:val="18"/>
+                <w:szCs w:val="18"/>
+              </w:rPr>
+              <w:t xml:space="preserve">        elif length != 0: length = lps[length - 1]</w:t>
+            </w:r>
+          </w:p>
+        </w:tc>
+      </w:tr>
+      <w:tr>
+        <w:tc>
+          <w:tcPr>
+            <w:tcW w:type="dxa" w:w="9360"/>
+            <w:tcBorders>
+              <w:top w:val="single" w:color="DDDDDD" w:sz="2"/>
+              <w:left w:val="single" w:color="DDDDDD" w:sz="2"/>
+              <w:bottom w:val="single" w:color="DDDDDD" w:sz="2"/>
+              <w:right w:val="single" w:color="DDDDDD" w:sz="2"/>
+            </w:tcBorders>
+            <w:shd w:fill="F5F5F5" w:val="clear"/>
+            <w:tcMar>
+              <w:top w:type="dxa" w:w="0"/>
+              <w:left w:type="dxa" w:w="120"/>
+              <w:bottom w:type="dxa" w:w="0"/>
+              <w:right w:type="dxa" w:w="120"/>
+            </w:tcMar>
+          </w:tcPr>
+          <w:p>
+            <w:pPr>
+              <w:spacing w:before="0" w:after="0" w:line="276"/>
+            </w:pPr>
+            <w:r>
+              <w:rPr>
+                <w:rFonts w:ascii="Courier New" w:cs="Courier New" w:eastAsia="Courier New" w:hAnsi="Courier New"/>
+                <w:b w:val="false"/>
+                <w:bCs w:val="false"/>
+                <w:i w:val="false"/>
+                <w:iCs w:val="false"/>
+                <w:color w:val="111111"/>
+                <w:sz w:val="18"/>
+                <w:szCs w:val="18"/>
+              </w:rPr>
+              <w:t xml:space="preserve">        else: lps[i] = 0; i += 1</w:t>
+            </w:r>
+          </w:p>
+        </w:tc>
+      </w:tr>
+      <w:tr>
+        <w:tc>
+          <w:tcPr>
+            <w:tcW w:type="dxa" w:w="9360"/>
+            <w:tcBorders>
+              <w:top w:val="single" w:color="DDDDDD" w:sz="2"/>
+              <w:left w:val="single" w:color="DDDDDD" w:sz="2"/>
+              <w:bottom w:val="single" w:color="DDDDDD" w:sz="2"/>
+              <w:right w:val="single" w:color="DDDDDD" w:sz="2"/>
+            </w:tcBorders>
+            <w:shd w:fill="F5F5F5" w:val="clear"/>
+            <w:tcMar>
+              <w:top w:type="dxa" w:w="0"/>
+              <w:left w:type="dxa" w:w="120"/>
+              <w:bottom w:type="dxa" w:w="0"/>
+              <w:right w:type="dxa" w:w="120"/>
+            </w:tcMar>
+          </w:tcPr>
+          <w:p>
+            <w:pPr>
+              <w:spacing w:before="0" w:after="0" w:line="276"/>
+            </w:pPr>
+            <w:r>
+              <w:rPr>
+                <w:rFonts w:ascii="Courier New" w:cs="Courier New" w:eastAsia="Courier New" w:hAnsi="Courier New"/>
+                <w:b w:val="false"/>
+                <w:bCs w:val="false"/>
+                <w:i w:val="false"/>
+                <w:iCs w:val="false"/>
+                <w:color w:val="111111"/>
+                <w:sz w:val="18"/>
+                <w:szCs w:val="18"/>
+              </w:rPr>
+              <w:t xml:space="preserve">    return lps</w:t>
+            </w:r>
+          </w:p>
+        </w:tc>
+      </w:tr>
+    </w:tbl>
+    <w:p>
+      <w:pPr>
+        <w:spacing w:before="60" w:after="240"/>
+      </w:pPr>
+      <w:r>
+        <w:rPr>
+          <w:rFonts w:ascii="Times New Roman" w:cs="Times New Roman" w:eastAsia="Times New Roman" w:hAnsi="Times New Roman"/>
+          <w:b w:val="false"/>
+          <w:bCs w:val="false"/>
+          <w:i/>
+          <w:iCs/>
+          <w:color w:val="666666"/>
+          <w:sz w:val="17"/>
+          <w:szCs w:val="17"/>
+        </w:rPr>
+        <w:t xml:space="preserve">Algorithme 4.1 — Calcul du tableau lps (Knuth–Morris–Pratt).</w:t>
+      </w:r>
+    </w:p>
+    <w:p>
+      <w:pPr>
+        <w:spacing w:before="0" w:after="80"/>
       </w:pPr>
     </w:p>
     <w:tbl>
@@ -428,6 +2795,8 @@
                 <w:rFonts w:ascii="Times New Roman" w:cs="Times New Roman" w:eastAsia="Times New Roman" w:hAnsi="Times New Roman"/>
                 <w:b/>
                 <w:bCs/>
+                <w:i w:val="false"/>
+                <w:iCs w:val="false"/>
                 <w:color w:val="FFFFFF"/>
                 <w:sz w:val="17"/>
                 <w:szCs w:val="17"/>
@@ -464,11 +2833,13 @@
                 <w:rFonts w:ascii="Times New Roman" w:cs="Times New Roman" w:eastAsia="Times New Roman" w:hAnsi="Times New Roman"/>
                 <w:b/>
                 <w:bCs/>
+                <w:i w:val="false"/>
+                <w:iCs w:val="false"/>
                 <w:color w:val="FFFFFF"/>
                 <w:sz w:val="17"/>
                 <w:szCs w:val="17"/>
               </w:rPr>
-              <w:t xml:space="preserve">Meilleur cas</w:t>
+              <w:t xml:space="preserve">Meilleur</w:t>
             </w:r>
           </w:p>
         </w:tc>
@@ -500,11 +2871,13 @@
                 <w:rFonts w:ascii="Times New Roman" w:cs="Times New Roman" w:eastAsia="Times New Roman" w:hAnsi="Times New Roman"/>
                 <w:b/>
                 <w:bCs/>
+                <w:i w:val="false"/>
+                <w:iCs w:val="false"/>
                 <w:color w:val="FFFFFF"/>
                 <w:sz w:val="17"/>
                 <w:szCs w:val="17"/>
               </w:rPr>
-              <w:t xml:space="preserve">Cas moyen</w:t>
+              <w:t xml:space="preserve">Moyen</w:t>
             </w:r>
           </w:p>
         </w:tc>
@@ -536,6 +2909,8 @@
                 <w:rFonts w:ascii="Times New Roman" w:cs="Times New Roman" w:eastAsia="Times New Roman" w:hAnsi="Times New Roman"/>
                 <w:b/>
                 <w:bCs/>
+                <w:i w:val="false"/>
+                <w:iCs w:val="false"/>
                 <w:color w:val="FFFFFF"/>
                 <w:sz w:val="17"/>
                 <w:szCs w:val="17"/>
@@ -572,6 +2947,8 @@
                 <w:rFonts w:ascii="Times New Roman" w:cs="Times New Roman" w:eastAsia="Times New Roman" w:hAnsi="Times New Roman"/>
                 <w:b/>
                 <w:bCs/>
+                <w:i w:val="false"/>
+                <w:iCs w:val="false"/>
                 <w:color w:val="FFFFFF"/>
                 <w:sz w:val="17"/>
                 <w:szCs w:val="17"/>
@@ -608,6 +2985,10 @@
             <w:r>
               <w:rPr>
                 <w:rFonts w:ascii="Times New Roman" w:cs="Times New Roman" w:eastAsia="Times New Roman" w:hAnsi="Times New Roman"/>
+                <w:b w:val="false"/>
+                <w:bCs w:val="false"/>
+                <w:i w:val="false"/>
+                <w:iCs w:val="false"/>
                 <w:color w:val="111111"/>
                 <w:sz w:val="17"/>
                 <w:szCs w:val="17"/>
@@ -642,9 +3023,13 @@
             <w:r>
               <w:rPr>
                 <w:rFonts w:ascii="Courier New" w:cs="Courier New" w:eastAsia="Courier New" w:hAnsi="Courier New"/>
+                <w:b w:val="false"/>
+                <w:bCs w:val="false"/>
+                <w:i w:val="false"/>
+                <w:iCs w:val="false"/>
                 <w:color w:val="333333"/>
-                <w:sz w:val="16"/>
-                <w:szCs w:val="16"/>
+                <w:sz w:val="17"/>
+                <w:szCs w:val="17"/>
               </w:rPr>
               <w:t xml:space="preserve">O(n)</w:t>
             </w:r>
@@ -676,9 +3061,13 @@
             <w:r>
               <w:rPr>
                 <w:rFonts w:ascii="Courier New" w:cs="Courier New" w:eastAsia="Courier New" w:hAnsi="Courier New"/>
+                <w:b w:val="false"/>
+                <w:bCs w:val="false"/>
+                <w:i w:val="false"/>
+                <w:iCs w:val="false"/>
                 <w:color w:val="333333"/>
-                <w:sz w:val="16"/>
-                <w:szCs w:val="16"/>
+                <w:sz w:val="17"/>
+                <w:szCs w:val="17"/>
               </w:rPr>
               <w:t xml:space="preserve">O(n²)</w:t>
             </w:r>
@@ -710,9 +3099,13 @@
             <w:r>
               <w:rPr>
                 <w:rFonts w:ascii="Courier New" w:cs="Courier New" w:eastAsia="Courier New" w:hAnsi="Courier New"/>
+                <w:b w:val="false"/>
+                <w:bCs w:val="false"/>
+                <w:i w:val="false"/>
+                <w:iCs w:val="false"/>
                 <w:color w:val="333333"/>
-                <w:sz w:val="16"/>
-                <w:szCs w:val="16"/>
+                <w:sz w:val="17"/>
+                <w:szCs w:val="17"/>
               </w:rPr>
               <w:t xml:space="preserve">O(n²)</w:t>
             </w:r>
@@ -744,9 +3137,13 @@
             <w:r>
               <w:rPr>
                 <w:rFonts w:ascii="Courier New" w:cs="Courier New" w:eastAsia="Courier New" w:hAnsi="Courier New"/>
+                <w:b w:val="false"/>
+                <w:bCs w:val="false"/>
+                <w:i w:val="false"/>
+                <w:iCs w:val="false"/>
                 <w:color w:val="333333"/>
-                <w:sz w:val="16"/>
-                <w:szCs w:val="16"/>
+                <w:sz w:val="17"/>
+                <w:szCs w:val="17"/>
               </w:rPr>
               <w:t xml:space="preserve">O(1)</w:t>
             </w:r>
@@ -780,6 +3177,10 @@
             <w:r>
               <w:rPr>
                 <w:rFonts w:ascii="Times New Roman" w:cs="Times New Roman" w:eastAsia="Times New Roman" w:hAnsi="Times New Roman"/>
+                <w:b w:val="false"/>
+                <w:bCs w:val="false"/>
+                <w:i w:val="false"/>
+                <w:iCs w:val="false"/>
                 <w:color w:val="111111"/>
                 <w:sz w:val="17"/>
                 <w:szCs w:val="17"/>
@@ -814,9 +3215,13 @@
             <w:r>
               <w:rPr>
                 <w:rFonts w:ascii="Courier New" w:cs="Courier New" w:eastAsia="Courier New" w:hAnsi="Courier New"/>
+                <w:b w:val="false"/>
+                <w:bCs w:val="false"/>
+                <w:i w:val="false"/>
+                <w:iCs w:val="false"/>
                 <w:color w:val="333333"/>
-                <w:sz w:val="16"/>
-                <w:szCs w:val="16"/>
+                <w:sz w:val="17"/>
+                <w:szCs w:val="17"/>
               </w:rPr>
               <w:t xml:space="preserve">O(n log n)</w:t>
             </w:r>
@@ -848,9 +3253,13 @@
             <w:r>
               <w:rPr>
                 <w:rFonts w:ascii="Courier New" w:cs="Courier New" w:eastAsia="Courier New" w:hAnsi="Courier New"/>
+                <w:b w:val="false"/>
+                <w:bCs w:val="false"/>
+                <w:i w:val="false"/>
+                <w:iCs w:val="false"/>
                 <w:color w:val="333333"/>
-                <w:sz w:val="16"/>
-                <w:szCs w:val="16"/>
+                <w:sz w:val="17"/>
+                <w:szCs w:val="17"/>
               </w:rPr>
               <w:t xml:space="preserve">O(n log n)</w:t>
             </w:r>
@@ -882,9 +3291,13 @@
             <w:r>
               <w:rPr>
                 <w:rFonts w:ascii="Courier New" w:cs="Courier New" w:eastAsia="Courier New" w:hAnsi="Courier New"/>
+                <w:b w:val="false"/>
+                <w:bCs w:val="false"/>
+                <w:i w:val="false"/>
+                <w:iCs w:val="false"/>
                 <w:color w:val="333333"/>
-                <w:sz w:val="16"/>
-                <w:szCs w:val="16"/>
+                <w:sz w:val="17"/>
+                <w:szCs w:val="17"/>
               </w:rPr>
               <w:t xml:space="preserve">O(n log n)</w:t>
             </w:r>
@@ -916,9 +3329,13 @@
             <w:r>
               <w:rPr>
                 <w:rFonts w:ascii="Courier New" w:cs="Courier New" w:eastAsia="Courier New" w:hAnsi="Courier New"/>
+                <w:b w:val="false"/>
+                <w:bCs w:val="false"/>
+                <w:i w:val="false"/>
+                <w:iCs w:val="false"/>
                 <w:color w:val="333333"/>
-                <w:sz w:val="16"/>
-                <w:szCs w:val="16"/>
+                <w:sz w:val="17"/>
+                <w:szCs w:val="17"/>
               </w:rPr>
               <w:t xml:space="preserve">O(n)</w:t>
             </w:r>
@@ -952,6 +3369,10 @@
             <w:r>
               <w:rPr>
                 <w:rFonts w:ascii="Times New Roman" w:cs="Times New Roman" w:eastAsia="Times New Roman" w:hAnsi="Times New Roman"/>
+                <w:b w:val="false"/>
+                <w:bCs w:val="false"/>
+                <w:i w:val="false"/>
+                <w:iCs w:val="false"/>
                 <w:color w:val="111111"/>
                 <w:sz w:val="17"/>
                 <w:szCs w:val="17"/>
@@ -986,9 +3407,13 @@
             <w:r>
               <w:rPr>
                 <w:rFonts w:ascii="Courier New" w:cs="Courier New" w:eastAsia="Courier New" w:hAnsi="Courier New"/>
+                <w:b w:val="false"/>
+                <w:bCs w:val="false"/>
+                <w:i w:val="false"/>
+                <w:iCs w:val="false"/>
                 <w:color w:val="333333"/>
-                <w:sz w:val="16"/>
-                <w:szCs w:val="16"/>
+                <w:sz w:val="17"/>
+                <w:szCs w:val="17"/>
               </w:rPr>
               <w:t xml:space="preserve">O(n log n)</w:t>
             </w:r>
@@ -1020,9 +3445,13 @@
             <w:r>
               <w:rPr>
                 <w:rFonts w:ascii="Courier New" w:cs="Courier New" w:eastAsia="Courier New" w:hAnsi="Courier New"/>
+                <w:b w:val="false"/>
+                <w:bCs w:val="false"/>
+                <w:i w:val="false"/>
+                <w:iCs w:val="false"/>
                 <w:color w:val="333333"/>
-                <w:sz w:val="16"/>
-                <w:szCs w:val="16"/>
+                <w:sz w:val="17"/>
+                <w:szCs w:val="17"/>
               </w:rPr>
               <w:t xml:space="preserve">O(n log n)</w:t>
             </w:r>
@@ -1054,9 +3483,13 @@
             <w:r>
               <w:rPr>
                 <w:rFonts w:ascii="Courier New" w:cs="Courier New" w:eastAsia="Courier New" w:hAnsi="Courier New"/>
+                <w:b w:val="false"/>
+                <w:bCs w:val="false"/>
+                <w:i w:val="false"/>
+                <w:iCs w:val="false"/>
                 <w:color w:val="333333"/>
-                <w:sz w:val="16"/>
-                <w:szCs w:val="16"/>
+                <w:sz w:val="17"/>
+                <w:szCs w:val="17"/>
               </w:rPr>
               <w:t xml:space="preserve">O(n²)</w:t>
             </w:r>
@@ -1088,9 +3521,13 @@
             <w:r>
               <w:rPr>
                 <w:rFonts w:ascii="Courier New" w:cs="Courier New" w:eastAsia="Courier New" w:hAnsi="Courier New"/>
+                <w:b w:val="false"/>
+                <w:bCs w:val="false"/>
+                <w:i w:val="false"/>
+                <w:iCs w:val="false"/>
                 <w:color w:val="333333"/>
-                <w:sz w:val="16"/>
-                <w:szCs w:val="16"/>
+                <w:sz w:val="17"/>
+                <w:szCs w:val="17"/>
               </w:rPr>
               <w:t xml:space="preserve">O(log n)</w:t>
             </w:r>
@@ -1124,6 +3561,10 @@
             <w:r>
               <w:rPr>
                 <w:rFonts w:ascii="Times New Roman" w:cs="Times New Roman" w:eastAsia="Times New Roman" w:hAnsi="Times New Roman"/>
+                <w:b w:val="false"/>
+                <w:bCs w:val="false"/>
+                <w:i w:val="false"/>
+                <w:iCs w:val="false"/>
                 <w:color w:val="111111"/>
                 <w:sz w:val="17"/>
                 <w:szCs w:val="17"/>
@@ -1158,9 +3599,13 @@
             <w:r>
               <w:rPr>
                 <w:rFonts w:ascii="Courier New" w:cs="Courier New" w:eastAsia="Courier New" w:hAnsi="Courier New"/>
+                <w:b w:val="false"/>
+                <w:bCs w:val="false"/>
+                <w:i w:val="false"/>
+                <w:iCs w:val="false"/>
                 <w:color w:val="333333"/>
-                <w:sz w:val="16"/>
-                <w:szCs w:val="16"/>
+                <w:sz w:val="17"/>
+                <w:szCs w:val="17"/>
               </w:rPr>
               <w:t xml:space="preserve">O(n log n)</w:t>
             </w:r>
@@ -1192,9 +3637,13 @@
             <w:r>
               <w:rPr>
                 <w:rFonts w:ascii="Courier New" w:cs="Courier New" w:eastAsia="Courier New" w:hAnsi="Courier New"/>
+                <w:b w:val="false"/>
+                <w:bCs w:val="false"/>
+                <w:i w:val="false"/>
+                <w:iCs w:val="false"/>
                 <w:color w:val="333333"/>
-                <w:sz w:val="16"/>
-                <w:szCs w:val="16"/>
+                <w:sz w:val="17"/>
+                <w:szCs w:val="17"/>
               </w:rPr>
               <w:t xml:space="preserve">O(n log n)</w:t>
             </w:r>
@@ -1226,9 +3675,13 @@
             <w:r>
               <w:rPr>
                 <w:rFonts w:ascii="Courier New" w:cs="Courier New" w:eastAsia="Courier New" w:hAnsi="Courier New"/>
+                <w:b w:val="false"/>
+                <w:bCs w:val="false"/>
+                <w:i w:val="false"/>
+                <w:iCs w:val="false"/>
                 <w:color w:val="333333"/>
-                <w:sz w:val="16"/>
-                <w:szCs w:val="16"/>
+                <w:sz w:val="17"/>
+                <w:szCs w:val="17"/>
               </w:rPr>
               <w:t xml:space="preserve">O(n log n)</w:t>
             </w:r>
@@ -1260,183 +3713,15 @@
             <w:r>
               <w:rPr>
                 <w:rFonts w:ascii="Courier New" w:cs="Courier New" w:eastAsia="Courier New" w:hAnsi="Courier New"/>
+                <w:b w:val="false"/>
+                <w:bCs w:val="false"/>
+                <w:i w:val="false"/>
+                <w:iCs w:val="false"/>
                 <w:color w:val="333333"/>
-                <w:sz w:val="16"/>
-                <w:szCs w:val="16"/>
-              </w:rPr>
-              <w:t xml:space="preserve">O(1)</w:t>
-            </w:r>
-          </w:p>
-        </w:tc>
-      </w:tr>
-      <w:tr>
-        <w:tc>
-          <w:tcPr>
-            <w:tcW w:type="dxa" w:w="1872"/>
-            <w:tcBorders>
-              <w:top w:val="single" w:color="CCCCCC" w:sz="2"/>
-              <w:left w:val="single" w:color="CCCCCC" w:sz="2"/>
-              <w:bottom w:val="single" w:color="CCCCCC" w:sz="2"/>
-              <w:right w:val="single" w:color="CCCCCC" w:sz="2"/>
-            </w:tcBorders>
-            <w:shd w:fill="FFFFFF" w:val="clear"/>
-            <w:tcMar>
-              <w:top w:type="dxa" w:w="60"/>
-              <w:left w:type="dxa" w:w="100"/>
-              <w:bottom w:type="dxa" w:w="60"/>
-              <w:right w:type="dxa" w:w="100"/>
-            </w:tcMar>
-            <w:vAlign w:val="center"/>
-          </w:tcPr>
-          <w:p>
-            <w:pPr>
-              <w:spacing w:before="0" w:after="0"/>
-              <w:jc w:val="left"/>
-            </w:pPr>
-            <w:r>
-              <w:rPr>
-                <w:rFonts w:ascii="Times New Roman" w:cs="Times New Roman" w:eastAsia="Times New Roman" w:hAnsi="Times New Roman"/>
-                <w:color w:val="111111"/>
                 <w:sz w:val="17"/>
                 <w:szCs w:val="17"/>
               </w:rPr>
-              <w:t xml:space="preserve">Timsort</w:t>
-            </w:r>
-          </w:p>
-        </w:tc>
-        <w:tc>
-          <w:tcPr>
-            <w:tcW w:type="dxa" w:w="1872"/>
-            <w:tcBorders>
-              <w:top w:val="single" w:color="CCCCCC" w:sz="2"/>
-              <w:left w:val="single" w:color="CCCCCC" w:sz="2"/>
-              <w:bottom w:val="single" w:color="CCCCCC" w:sz="2"/>
-              <w:right w:val="single" w:color="CCCCCC" w:sz="2"/>
-            </w:tcBorders>
-            <w:shd w:fill="FFFFFF" w:val="clear"/>
-            <w:tcMar>
-              <w:top w:type="dxa" w:w="60"/>
-              <w:left w:type="dxa" w:w="100"/>
-              <w:bottom w:type="dxa" w:w="60"/>
-              <w:right w:type="dxa" w:w="100"/>
-            </w:tcMar>
-            <w:vAlign w:val="center"/>
-          </w:tcPr>
-          <w:p>
-            <w:pPr>
-              <w:spacing w:before="0" w:after="0"/>
-              <w:jc w:val="left"/>
-            </w:pPr>
-            <w:r>
-              <w:rPr>
-                <w:rFonts w:ascii="Courier New" w:cs="Courier New" w:eastAsia="Courier New" w:hAnsi="Courier New"/>
-                <w:color w:val="333333"/>
-                <w:sz w:val="16"/>
-                <w:szCs w:val="16"/>
-              </w:rPr>
-              <w:t xml:space="preserve">O(n)</w:t>
-            </w:r>
-          </w:p>
-        </w:tc>
-        <w:tc>
-          <w:tcPr>
-            <w:tcW w:type="dxa" w:w="1872"/>
-            <w:tcBorders>
-              <w:top w:val="single" w:color="CCCCCC" w:sz="2"/>
-              <w:left w:val="single" w:color="CCCCCC" w:sz="2"/>
-              <w:bottom w:val="single" w:color="CCCCCC" w:sz="2"/>
-              <w:right w:val="single" w:color="CCCCCC" w:sz="2"/>
-            </w:tcBorders>
-            <w:shd w:fill="FFFFFF" w:val="clear"/>
-            <w:tcMar>
-              <w:top w:type="dxa" w:w="60"/>
-              <w:left w:type="dxa" w:w="100"/>
-              <w:bottom w:type="dxa" w:w="60"/>
-              <w:right w:type="dxa" w:w="100"/>
-            </w:tcMar>
-            <w:vAlign w:val="center"/>
-          </w:tcPr>
-          <w:p>
-            <w:pPr>
-              <w:spacing w:before="0" w:after="0"/>
-              <w:jc w:val="left"/>
-            </w:pPr>
-            <w:r>
-              <w:rPr>
-                <w:rFonts w:ascii="Courier New" w:cs="Courier New" w:eastAsia="Courier New" w:hAnsi="Courier New"/>
-                <w:color w:val="333333"/>
-                <w:sz w:val="16"/>
-                <w:szCs w:val="16"/>
-              </w:rPr>
-              <w:t xml:space="preserve">O(n log n)</w:t>
-            </w:r>
-          </w:p>
-        </w:tc>
-        <w:tc>
-          <w:tcPr>
-            <w:tcW w:type="dxa" w:w="1872"/>
-            <w:tcBorders>
-              <w:top w:val="single" w:color="CCCCCC" w:sz="2"/>
-              <w:left w:val="single" w:color="CCCCCC" w:sz="2"/>
-              <w:bottom w:val="single" w:color="CCCCCC" w:sz="2"/>
-              <w:right w:val="single" w:color="CCCCCC" w:sz="2"/>
-            </w:tcBorders>
-            <w:shd w:fill="FFFFFF" w:val="clear"/>
-            <w:tcMar>
-              <w:top w:type="dxa" w:w="60"/>
-              <w:left w:type="dxa" w:w="100"/>
-              <w:bottom w:type="dxa" w:w="60"/>
-              <w:right w:type="dxa" w:w="100"/>
-            </w:tcMar>
-            <w:vAlign w:val="center"/>
-          </w:tcPr>
-          <w:p>
-            <w:pPr>
-              <w:spacing w:before="0" w:after="0"/>
-              <w:jc w:val="left"/>
-            </w:pPr>
-            <w:r>
-              <w:rPr>
-                <w:rFonts w:ascii="Courier New" w:cs="Courier New" w:eastAsia="Courier New" w:hAnsi="Courier New"/>
-                <w:color w:val="333333"/>
-                <w:sz w:val="16"/>
-                <w:szCs w:val="16"/>
-              </w:rPr>
-              <w:t xml:space="preserve">O(n log n)</w:t>
-            </w:r>
-          </w:p>
-        </w:tc>
-        <w:tc>
-          <w:tcPr>
-            <w:tcW w:type="dxa" w:w="1872"/>
-            <w:tcBorders>
-              <w:top w:val="single" w:color="CCCCCC" w:sz="2"/>
-              <w:left w:val="single" w:color="CCCCCC" w:sz="2"/>
-              <w:bottom w:val="single" w:color="CCCCCC" w:sz="2"/>
-              <w:right w:val="single" w:color="CCCCCC" w:sz="2"/>
-            </w:tcBorders>
-            <w:shd w:fill="FFFFFF" w:val="clear"/>
-            <w:tcMar>
-              <w:top w:type="dxa" w:w="60"/>
-              <w:left w:type="dxa" w:w="100"/>
-              <w:bottom w:type="dxa" w:w="60"/>
-              <w:right w:type="dxa" w:w="100"/>
-            </w:tcMar>
-            <w:vAlign w:val="center"/>
-          </w:tcPr>
-          <w:p>
-            <w:pPr>
-              <w:spacing w:before="0" w:after="0"/>
-              <w:jc w:val="left"/>
-            </w:pPr>
-            <w:r>
-              <w:rPr>
-                <w:rFonts w:ascii="Courier New" w:cs="Courier New" w:eastAsia="Courier New" w:hAnsi="Courier New"/>
-                <w:color w:val="333333"/>
-                <w:sz w:val="16"/>
-                <w:szCs w:val="16"/>
-              </w:rPr>
-              <w:t xml:space="preserve">O(n)</w:t>
+              <w:t xml:space="preserve">O(1)</w:t>
             </w:r>
           </w:p>
         </w:tc>
@@ -1445,18 +3730,24 @@
     <w:p>
       <w:pPr>
         <w:spacing w:before="60" w:after="240"/>
-        <w:jc w:val="left"/>
       </w:pPr>
       <w:r>
         <w:rPr>
           <w:rFonts w:ascii="Times New Roman" w:cs="Times New Roman" w:eastAsia="Times New Roman" w:hAnsi="Times New Roman"/>
+          <w:b w:val="false"/>
+          <w:bCs w:val="false"/>
           <w:i/>
           <w:iCs/>
           <w:color w:val="666666"/>
           <w:sz w:val="17"/>
           <w:szCs w:val="17"/>
         </w:rPr>
-        <w:t xml:space="preserve">Table 2.1 — Complexités des algorithmes de tri dans le modèle de comparaison.</w:t>
+        <w:t xml:space="preserve">Table 4.1 — Complexités des algorithmes de tri.</w:t>
+      </w:r>
+    </w:p>
+    <w:p>
+      <w:r>
+        <w:br w:type="page"/>
       </w:r>
     </w:p>
     <w:p>
@@ -1466,11 +3757,15 @@
       <w:r>
         <w:rPr>
           <w:rFonts w:ascii="Courier New" w:cs="Courier New" w:eastAsia="Courier New" w:hAnsi="Courier New"/>
+          <w:b w:val="false"/>
+          <w:bCs w:val="false"/>
+          <w:i w:val="false"/>
+          <w:iCs w:val="false"/>
           <w:color w:val="AAAAAA"/>
           <w:sz w:val="16"/>
           <w:szCs w:val="16"/>
         </w:rPr>
-        <w:t xml:space="preserve">§ 3</w:t>
+        <w:t xml:space="preserve">Références</w:t>
       </w:r>
     </w:p>
     <w:p>
@@ -1484,11 +3779,13 @@
           <w:rFonts w:ascii="Times New Roman" w:cs="Times New Roman" w:eastAsia="Times New Roman" w:hAnsi="Times New Roman"/>
           <w:b/>
           <w:bCs/>
+          <w:i w:val="false"/>
+          <w:iCs w:val="false"/>
           <w:color w:val="111111"/>
           <w:sz w:val="34"/>
           <w:szCs w:val="34"/>
         </w:rPr>
-        <w:t xml:space="preserve">Listes et code source</w:t>
+        <w:t xml:space="preserve">Références</w:t>
       </w:r>
     </w:p>
     <w:p>
@@ -1501,9 +3798,7 @@
     </w:p>
     <w:p>
       <w:pPr>
-        <w:pStyle w:val="bodyText"/>
-        <w:spacing w:line="360" w:before="0" w:after="120"/>
-        <w:jc w:val="both"/>
+        <w:spacing w:before="0" w:after="120"/>
       </w:pPr>
       <w:r>
         <w:rPr>
@@ -1512,85 +3807,16 @@
           <w:bCs w:val="false"/>
           <w:i w:val="false"/>
           <w:iCs w:val="false"/>
-          <w:color w:val="111111"/>
-          <w:sz w:val="22"/>
-          <w:szCs w:val="22"/>
+          <w:color w:val="333333"/>
+          <w:sz w:val="20"/>
+          <w:szCs w:val="20"/>
         </w:rPr>
-        <w:t xml:space="preserve">Les listes non ordonnées utilisent un tiret long comme marqueur, conformément à la typographie française classique :</w:t>
+        <w:t xml:space="preserve">[1] D. E. Knuth, The Art of Computer Programming, Vol. 1, Addison-Wesley, 1997.</w:t>
       </w:r>
     </w:p>
     <w:p>
       <w:pPr>
         <w:spacing w:before="0" w:after="120"/>
-      </w:pPr>
-    </w:p>
-    <w:p>
-      <w:pPr>
-        <w:pStyle w:val="ListParagraph"/>
-        <w:numPr>
-          <w:ilvl w:val="0"/>
-          <w:numId w:val="2"/>
-        </w:numPr>
-        <w:spacing w:before="0" w:after="80"/>
-      </w:pPr>
-      <w:r>
-        <w:rPr>
-          <w:rFonts w:ascii="Times New Roman" w:cs="Times New Roman" w:eastAsia="Times New Roman" w:hAnsi="Times New Roman"/>
-          <w:color w:val="111111"/>
-          <w:sz w:val="22"/>
-          <w:szCs w:val="22"/>
-        </w:rPr>
-        <w:t xml:space="preserve">Premier élément de la liste avec explication concise</w:t>
-      </w:r>
-    </w:p>
-    <w:p>
-      <w:pPr>
-        <w:pStyle w:val="ListParagraph"/>
-        <w:numPr>
-          <w:ilvl w:val="0"/>
-          <w:numId w:val="2"/>
-        </w:numPr>
-        <w:spacing w:before="0" w:after="80"/>
-      </w:pPr>
-      <w:r>
-        <w:rPr>
-          <w:rFonts w:ascii="Times New Roman" w:cs="Times New Roman" w:eastAsia="Times New Roman" w:hAnsi="Times New Roman"/>
-          <w:color w:val="111111"/>
-          <w:sz w:val="22"/>
-          <w:szCs w:val="22"/>
-        </w:rPr>
-        <w:t xml:space="preserve">Deuxième élément — note ou précision complémentaire</w:t>
-      </w:r>
-    </w:p>
-    <w:p>
-      <w:pPr>
-        <w:pStyle w:val="ListParagraph"/>
-        <w:numPr>
-          <w:ilvl w:val="0"/>
-          <w:numId w:val="2"/>
-        </w:numPr>
-        <w:spacing w:before="0" w:after="80"/>
-      </w:pPr>
-      <w:r>
-        <w:rPr>
-          <w:rFonts w:ascii="Times New Roman" w:cs="Times New Roman" w:eastAsia="Times New Roman" w:hAnsi="Times New Roman"/>
-          <w:color w:val="111111"/>
-          <w:sz w:val="22"/>
-          <w:szCs w:val="22"/>
-        </w:rPr>
-        <w:t xml:space="preserve">Troisième élément illustrant la structure de liste</w:t>
-      </w:r>
-    </w:p>
-    <w:p>
-      <w:pPr>
-        <w:spacing w:before="0" w:after="160"/>
-      </w:pPr>
-    </w:p>
-    <w:p>
-      <w:pPr>
-        <w:pStyle w:val="bodyText"/>
-        <w:spacing w:line="360" w:before="0" w:after="120"/>
-        <w:jc w:val="both"/>
       </w:pPr>
       <w:r>
         <w:rPr>
@@ -1599,373 +3825,16 @@
           <w:bCs w:val="false"/>
           <w:i w:val="false"/>
           <w:iCs w:val="false"/>
-          <w:color w:val="111111"/>
-          <w:sz w:val="22"/>
-          <w:szCs w:val="22"/>
+          <w:color w:val="333333"/>
+          <w:sz w:val="20"/>
+          <w:szCs w:val="20"/>
         </w:rPr>
-        <w:t xml:space="preserve">Les blocs de code sont composés en Courier New 9 pt sur fond gris clair :</w:t>
+        <w:t xml:space="preserve">[2] D. E. Knuth, The Art of Computer Programming, Vol. 3, Addison-Wesley, 1998.</w:t>
       </w:r>
     </w:p>
     <w:p>
       <w:pPr>
-        <w:spacing w:before="0" w:after="80"/>
-      </w:pPr>
-    </w:p>
-    <w:tbl>
-      <w:tblPr>
-        <w:tblW w:type="dxa" w:w="9360"/>
-        <w:tblBorders>
-          <w:top w:val="single" w:color="auto" w:sz="4"/>
-          <w:left w:val="single" w:color="auto" w:sz="4"/>
-          <w:bottom w:val="single" w:color="auto" w:sz="4"/>
-          <w:right w:val="single" w:color="auto" w:sz="4"/>
-          <w:insideH w:val="single" w:color="auto" w:sz="4"/>
-          <w:insideV w:val="single" w:color="auto" w:sz="4"/>
-        </w:tblBorders>
-      </w:tblPr>
-      <w:tblGrid>
-        <w:gridCol w:w="9360"/>
-      </w:tblGrid>
-      <w:tr>
-        <w:tc>
-          <w:tcPr>
-            <w:tcW w:type="dxa" w:w="9360"/>
-            <w:tcBorders>
-              <w:top w:val="single" w:color="E0E0E0" w:sz="2"/>
-              <w:left w:val="single" w:color="E0E0E0" w:sz="2"/>
-              <w:bottom w:val="single" w:color="E0E0E0" w:sz="2"/>
-              <w:right w:val="single" w:color="E0E0E0" w:sz="2"/>
-            </w:tcBorders>
-            <w:shd w:fill="F5F5F5" w:val="clear"/>
-            <w:tcMar>
-              <w:top w:type="dxa" w:w="0"/>
-              <w:left w:type="dxa" w:w="120"/>
-              <w:bottom w:type="dxa" w:w="0"/>
-              <w:right w:type="dxa" w:w="120"/>
-            </w:tcMar>
-          </w:tcPr>
-          <w:p>
-            <w:pPr>
-              <w:spacing w:before="0" w:after="0" w:line="276"/>
-            </w:pPr>
-            <w:r>
-              <w:rPr>
-                <w:rFonts w:ascii="Courier New" w:cs="Courier New" w:eastAsia="Courier New" w:hAnsi="Courier New"/>
-                <w:color w:val="111111"/>
-                <w:sz w:val="18"/>
-                <w:szCs w:val="18"/>
-              </w:rPr>
-              <w:t xml:space="preserve">function kmp_search(text, pattern):</w:t>
-            </w:r>
-          </w:p>
-        </w:tc>
-      </w:tr>
-      <w:tr>
-        <w:tc>
-          <w:tcPr>
-            <w:tcW w:type="dxa" w:w="9360"/>
-            <w:tcBorders>
-              <w:top w:val="single" w:color="E0E0E0" w:sz="2"/>
-              <w:left w:val="single" w:color="E0E0E0" w:sz="2"/>
-              <w:bottom w:val="single" w:color="E0E0E0" w:sz="2"/>
-              <w:right w:val="single" w:color="E0E0E0" w:sz="2"/>
-            </w:tcBorders>
-            <w:shd w:fill="F5F5F5" w:val="clear"/>
-            <w:tcMar>
-              <w:top w:type="dxa" w:w="0"/>
-              <w:left w:type="dxa" w:w="120"/>
-              <w:bottom w:type="dxa" w:w="0"/>
-              <w:right w:type="dxa" w:w="120"/>
-            </w:tcMar>
-          </w:tcPr>
-          <w:p>
-            <w:pPr>
-              <w:spacing w:before="0" w:after="0" w:line="276"/>
-            </w:pPr>
-            <w:r>
-              <w:rPr>
-                <w:rFonts w:ascii="Courier New" w:cs="Courier New" w:eastAsia="Courier New" w:hAnsi="Courier New"/>
-                <w:color w:val="111111"/>
-                <w:sz w:val="18"/>
-                <w:szCs w:val="18"/>
-              </w:rPr>
-              <w:t xml:space="preserve">    n, m := len(text), len(pattern)</w:t>
-            </w:r>
-          </w:p>
-        </w:tc>
-      </w:tr>
-      <w:tr>
-        <w:tc>
-          <w:tcPr>
-            <w:tcW w:type="dxa" w:w="9360"/>
-            <w:tcBorders>
-              <w:top w:val="single" w:color="E0E0E0" w:sz="2"/>
-              <w:left w:val="single" w:color="E0E0E0" w:sz="2"/>
-              <w:bottom w:val="single" w:color="E0E0E0" w:sz="2"/>
-              <w:right w:val="single" w:color="E0E0E0" w:sz="2"/>
-            </w:tcBorders>
-            <w:shd w:fill="F5F5F5" w:val="clear"/>
-            <w:tcMar>
-              <w:top w:type="dxa" w:w="0"/>
-              <w:left w:type="dxa" w:w="120"/>
-              <w:bottom w:type="dxa" w:w="0"/>
-              <w:right w:type="dxa" w:w="120"/>
-            </w:tcMar>
-          </w:tcPr>
-          <w:p>
-            <w:pPr>
-              <w:spacing w:before="0" w:after="0" w:line="276"/>
-            </w:pPr>
-            <w:r>
-              <w:rPr>
-                <w:rFonts w:ascii="Courier New" w:cs="Courier New" w:eastAsia="Courier New" w:hAnsi="Courier New"/>
-                <w:color w:val="111111"/>
-                <w:sz w:val="18"/>
-                <w:szCs w:val="18"/>
-              </w:rPr>
-              <w:t xml:space="preserve">    lps  := compute_lps(pattern)    -- Longest proper prefix-suffix</w:t>
-            </w:r>
-          </w:p>
-        </w:tc>
-      </w:tr>
-      <w:tr>
-        <w:tc>
-          <w:tcPr>
-            <w:tcW w:type="dxa" w:w="9360"/>
-            <w:tcBorders>
-              <w:top w:val="single" w:color="E0E0E0" w:sz="2"/>
-              <w:left w:val="single" w:color="E0E0E0" w:sz="2"/>
-              <w:bottom w:val="single" w:color="E0E0E0" w:sz="2"/>
-              <w:right w:val="single" w:color="E0E0E0" w:sz="2"/>
-            </w:tcBorders>
-            <w:shd w:fill="F5F5F5" w:val="clear"/>
-            <w:tcMar>
-              <w:top w:type="dxa" w:w="0"/>
-              <w:left w:type="dxa" w:w="120"/>
-              <w:bottom w:type="dxa" w:w="0"/>
-              <w:right w:type="dxa" w:w="120"/>
-            </w:tcMar>
-          </w:tcPr>
-          <w:p>
-            <w:pPr>
-              <w:spacing w:before="0" w:after="0" w:line="276"/>
-            </w:pPr>
-            <w:r>
-              <w:rPr>
-                <w:rFonts w:ascii="Courier New" w:cs="Courier New" w:eastAsia="Courier New" w:hAnsi="Courier New"/>
-                <w:color w:val="111111"/>
-                <w:sz w:val="18"/>
-                <w:szCs w:val="18"/>
-              </w:rPr>
-              <w:t xml:space="preserve">    i := 0;  j := 0</w:t>
-            </w:r>
-          </w:p>
-        </w:tc>
-      </w:tr>
-      <w:tr>
-        <w:tc>
-          <w:tcPr>
-            <w:tcW w:type="dxa" w:w="9360"/>
-            <w:tcBorders>
-              <w:top w:val="single" w:color="E0E0E0" w:sz="2"/>
-              <w:left w:val="single" w:color="E0E0E0" w:sz="2"/>
-              <w:bottom w:val="single" w:color="E0E0E0" w:sz="2"/>
-              <w:right w:val="single" w:color="E0E0E0" w:sz="2"/>
-            </w:tcBorders>
-            <w:shd w:fill="F5F5F5" w:val="clear"/>
-            <w:tcMar>
-              <w:top w:type="dxa" w:w="0"/>
-              <w:left w:type="dxa" w:w="120"/>
-              <w:bottom w:type="dxa" w:w="0"/>
-              <w:right w:type="dxa" w:w="120"/>
-            </w:tcMar>
-          </w:tcPr>
-          <w:p>
-            <w:pPr>
-              <w:spacing w:before="0" w:after="0" w:line="276"/>
-            </w:pPr>
-            <w:r>
-              <w:rPr>
-                <w:rFonts w:ascii="Courier New" w:cs="Courier New" w:eastAsia="Courier New" w:hAnsi="Courier New"/>
-                <w:color w:val="111111"/>
-                <w:sz w:val="18"/>
-                <w:szCs w:val="18"/>
-              </w:rPr>
-              <w:t xml:space="preserve">    while i &lt; n do</w:t>
-            </w:r>
-          </w:p>
-        </w:tc>
-      </w:tr>
-      <w:tr>
-        <w:tc>
-          <w:tcPr>
-            <w:tcW w:type="dxa" w:w="9360"/>
-            <w:tcBorders>
-              <w:top w:val="single" w:color="E0E0E0" w:sz="2"/>
-              <w:left w:val="single" w:color="E0E0E0" w:sz="2"/>
-              <w:bottom w:val="single" w:color="E0E0E0" w:sz="2"/>
-              <w:right w:val="single" w:color="E0E0E0" w:sz="2"/>
-            </w:tcBorders>
-            <w:shd w:fill="F5F5F5" w:val="clear"/>
-            <w:tcMar>
-              <w:top w:type="dxa" w:w="0"/>
-              <w:left w:type="dxa" w:w="120"/>
-              <w:bottom w:type="dxa" w:w="0"/>
-              <w:right w:type="dxa" w:w="120"/>
-            </w:tcMar>
-          </w:tcPr>
-          <w:p>
-            <w:pPr>
-              <w:spacing w:before="0" w:after="0" w:line="276"/>
-            </w:pPr>
-            <w:r>
-              <w:rPr>
-                <w:rFonts w:ascii="Courier New" w:cs="Courier New" w:eastAsia="Courier New" w:hAnsi="Courier New"/>
-                <w:color w:val="111111"/>
-                <w:sz w:val="18"/>
-                <w:szCs w:val="18"/>
-              </w:rPr>
-              <w:t xml:space="preserve">        if pattern[j] = text[i] then</w:t>
-            </w:r>
-          </w:p>
-        </w:tc>
-      </w:tr>
-      <w:tr>
-        <w:tc>
-          <w:tcPr>
-            <w:tcW w:type="dxa" w:w="9360"/>
-            <w:tcBorders>
-              <w:top w:val="single" w:color="E0E0E0" w:sz="2"/>
-              <w:left w:val="single" w:color="E0E0E0" w:sz="2"/>
-              <w:bottom w:val="single" w:color="E0E0E0" w:sz="2"/>
-              <w:right w:val="single" w:color="E0E0E0" w:sz="2"/>
-            </w:tcBorders>
-            <w:shd w:fill="F5F5F5" w:val="clear"/>
-            <w:tcMar>
-              <w:top w:type="dxa" w:w="0"/>
-              <w:left w:type="dxa" w:w="120"/>
-              <w:bottom w:type="dxa" w:w="0"/>
-              <w:right w:type="dxa" w:w="120"/>
-            </w:tcMar>
-          </w:tcPr>
-          <w:p>
-            <w:pPr>
-              <w:spacing w:before="0" w:after="0" w:line="276"/>
-            </w:pPr>
-            <w:r>
-              <w:rPr>
-                <w:rFonts w:ascii="Courier New" w:cs="Courier New" w:eastAsia="Courier New" w:hAnsi="Courier New"/>
-                <w:color w:val="111111"/>
-                <w:sz w:val="18"/>
-                <w:szCs w:val="18"/>
-              </w:rPr>
-              <w:t xml:space="preserve">            i++; j++</w:t>
-            </w:r>
-          </w:p>
-        </w:tc>
-      </w:tr>
-      <w:tr>
-        <w:tc>
-          <w:tcPr>
-            <w:tcW w:type="dxa" w:w="9360"/>
-            <w:tcBorders>
-              <w:top w:val="single" w:color="E0E0E0" w:sz="2"/>
-              <w:left w:val="single" w:color="E0E0E0" w:sz="2"/>
-              <w:bottom w:val="single" w:color="E0E0E0" w:sz="2"/>
-              <w:right w:val="single" w:color="E0E0E0" w:sz="2"/>
-            </w:tcBorders>
-            <w:shd w:fill="F5F5F5" w:val="clear"/>
-            <w:tcMar>
-              <w:top w:type="dxa" w:w="0"/>
-              <w:left w:type="dxa" w:w="120"/>
-              <w:bottom w:type="dxa" w:w="0"/>
-              <w:right w:type="dxa" w:w="120"/>
-            </w:tcMar>
-          </w:tcPr>
-          <w:p>
-            <w:pPr>
-              <w:spacing w:before="0" w:after="0" w:line="276"/>
-            </w:pPr>
-            <w:r>
-              <w:rPr>
-                <w:rFonts w:ascii="Courier New" w:cs="Courier New" w:eastAsia="Courier New" w:hAnsi="Courier New"/>
-                <w:color w:val="111111"/>
-                <w:sz w:val="18"/>
-                <w:szCs w:val="18"/>
-              </w:rPr>
-              <w:t xml:space="preserve">        if j = m then return i - j  -- Match found</w:t>
-            </w:r>
-          </w:p>
-        </w:tc>
-      </w:tr>
-    </w:tbl>
-    <w:p>
-      <w:pPr>
-        <w:spacing w:before="60" w:after="240"/>
-        <w:jc w:val="left"/>
-      </w:pPr>
-      <w:r>
-        <w:rPr>
-          <w:rFonts w:ascii="Times New Roman" w:cs="Times New Roman" w:eastAsia="Times New Roman" w:hAnsi="Times New Roman"/>
-          <w:i/>
-          <w:iCs/>
-          <w:color w:val="666666"/>
-          <w:sz w:val="17"/>
-          <w:szCs w:val="17"/>
-        </w:rPr>
-        <w:t xml:space="preserve">Algorithme 3.1 — Recherche de motif par Knuth–Morris–Pratt.</w:t>
-      </w:r>
-    </w:p>
-    <w:p>
-      <w:r>
-        <w:br w:type="page"/>
-      </w:r>
-    </w:p>
-    <w:p>
-      <w:pPr>
-        <w:spacing w:before="320" w:after="40"/>
-      </w:pPr>
-      <w:r>
-        <w:rPr>
-          <w:rFonts w:ascii="Courier New" w:cs="Courier New" w:eastAsia="Courier New" w:hAnsi="Courier New"/>
-          <w:color w:val="AAAAAA"/>
-          <w:sz w:val="16"/>
-          <w:szCs w:val="16"/>
-        </w:rPr>
-        <w:t xml:space="preserve">§ 4</w:t>
-      </w:r>
-    </w:p>
-    <w:p>
-      <w:pPr>
-        <w:pStyle w:val="Heading1"/>
-        <w:spacing w:before="120" w:after="200"/>
-        <w:outlineLvl w:val="0"/>
-      </w:pPr>
-      <w:r>
-        <w:rPr>
-          <w:rFonts w:ascii="Times New Roman" w:cs="Times New Roman" w:eastAsia="Times New Roman" w:hAnsi="Times New Roman"/>
-          <w:b/>
-          <w:bCs/>
-          <w:color w:val="111111"/>
-          <w:sz w:val="34"/>
-          <w:szCs w:val="34"/>
-        </w:rPr>
-        <w:t xml:space="preserve">Conclusion</w:t>
-      </w:r>
-    </w:p>
-    <w:p>
-      <w:pPr>
-        <w:pBdr>
-          <w:bottom w:val="single" w:color="CCCCCC" w:sz="2" w:space="4"/>
-        </w:pBdr>
-        <w:spacing w:before="80" w:after="80"/>
-      </w:pPr>
-    </w:p>
-    <w:p>
-      <w:pPr>
-        <w:pStyle w:val="bodyText"/>
-        <w:spacing w:line="360" w:before="0" w:after="120"/>
-        <w:jc w:val="both"/>
+        <w:spacing w:before="0" w:after="120"/>
       </w:pPr>
       <w:r>
         <w:rPr>
@@ -1974,113 +3843,11 @@
           <w:bCs w:val="false"/>
           <w:i w:val="false"/>
           <w:iCs w:val="false"/>
-          <w:color w:val="111111"/>
-          <w:sz w:val="22"/>
-          <w:szCs w:val="22"/>
-        </w:rPr>
-        <w:t xml:space="preserve">Texte de conclusion. Rappel des points essentiels, ouverture sur des perspectives de travaux futurs.</w:t>
-      </w:r>
-    </w:p>
-    <w:p>
-      <w:pPr>
-        <w:pStyle w:val="bodyText"/>
-        <w:spacing w:line="360" w:before="0" w:after="120"/>
-        <w:jc w:val="both"/>
-      </w:pPr>
-      <w:r>
-        <w:rPr>
-          <w:rFonts w:ascii="Times New Roman" w:cs="Times New Roman" w:eastAsia="Times New Roman" w:hAnsi="Times New Roman"/>
-          <w:b w:val="false"/>
-          <w:bCs w:val="false"/>
-          <w:i w:val="false"/>
-          <w:iCs w:val="false"/>
-          <w:color w:val="111111"/>
-          <w:sz w:val="22"/>
-          <w:szCs w:val="22"/>
-        </w:rPr>
-        <w:t xml:space="preserve">Ce document est un template conforme à la Charte Graphique Minimaliste Ars Typographica, version 1.0 (Mars 2026). Les styles sont définis pour Heading 1–3, corps de texte justifié, légende, bloc de code et liste.</w:t>
-      </w:r>
-    </w:p>
-    <w:p>
-      <w:pPr>
-        <w:spacing w:before="320" w:after="40"/>
-      </w:pPr>
-      <w:r>
-        <w:rPr>
-          <w:rFonts w:ascii="Courier New" w:cs="Courier New" w:eastAsia="Courier New" w:hAnsi="Courier New"/>
-          <w:color w:val="AAAAAA"/>
-          <w:sz w:val="16"/>
-          <w:szCs w:val="16"/>
-        </w:rPr>
-        <w:t xml:space="preserve">Références</w:t>
-      </w:r>
-    </w:p>
-    <w:p>
-      <w:pPr>
-        <w:pStyle w:val="Heading1"/>
-        <w:spacing w:before="120" w:after="200"/>
-        <w:outlineLvl w:val="0"/>
-      </w:pPr>
-      <w:r>
-        <w:rPr>
-          <w:rFonts w:ascii="Times New Roman" w:cs="Times New Roman" w:eastAsia="Times New Roman" w:hAnsi="Times New Roman"/>
-          <w:b/>
-          <w:bCs/>
-          <w:color w:val="111111"/>
-          <w:sz w:val="34"/>
-          <w:szCs w:val="34"/>
-        </w:rPr>
-        <w:t xml:space="preserve">Références</w:t>
-      </w:r>
-    </w:p>
-    <w:p>
-      <w:pPr>
-        <w:pBdr>
-          <w:bottom w:val="single" w:color="CCCCCC" w:sz="2" w:space="4"/>
-        </w:pBdr>
-        <w:spacing w:before="80" w:after="80"/>
-      </w:pPr>
-    </w:p>
-    <w:p>
-      <w:pPr>
-        <w:spacing w:before="0" w:after="120"/>
-      </w:pPr>
-      <w:r>
-        <w:rPr>
-          <w:rFonts w:ascii="Times New Roman" w:cs="Times New Roman" w:eastAsia="Times New Roman" w:hAnsi="Times New Roman"/>
           <w:color w:val="333333"/>
           <w:sz w:val="20"/>
           <w:szCs w:val="20"/>
         </w:rPr>
-        <w:t xml:space="preserve">[1] Donald E. Knuth, «The Art of Computer Programming, Vol. 1 : Fundamental Algorithms», 3ᵉ éd., Addison-Wesley, 1997.</w:t>
-      </w:r>
-    </w:p>
-    <w:p>
-      <w:pPr>
-        <w:spacing w:before="0" w:after="120"/>
-      </w:pPr>
-      <w:r>
-        <w:rPr>
-          <w:rFonts w:ascii="Times New Roman" w:cs="Times New Roman" w:eastAsia="Times New Roman" w:hAnsi="Times New Roman"/>
-          <w:color w:val="333333"/>
-          <w:sz w:val="20"/>
-          <w:szCs w:val="20"/>
-        </w:rPr>
-        <w:t xml:space="preserve">[2] Donald E. Knuth, «The Art of Computer Programming, Vol. 3 : Sorting and Searching», 2ᵉ éd., Addison-Wesley, 1998.</w:t>
-      </w:r>
-    </w:p>
-    <w:p>
-      <w:pPr>
-        <w:spacing w:before="0" w:after="120"/>
-      </w:pPr>
-      <w:r>
-        <w:rPr>
-          <w:rFonts w:ascii="Times New Roman" w:cs="Times New Roman" w:eastAsia="Times New Roman" w:hAnsi="Times New Roman"/>
-          <w:color w:val="333333"/>
-          <w:sz w:val="20"/>
-          <w:szCs w:val="20"/>
-        </w:rPr>
-        <w:t xml:space="preserve">[3] Donald E. Knuth, «The TeXbook», Addison-Wesley, 1984.</w:t>
+        <w:t xml:space="preserve">[3] W. Rudin, Principles of Mathematical Analysis, McGraw-Hill, 1976.</w:t>
       </w:r>
     </w:p>
     <w:sectPr>
@@ -2177,6 +3944,8 @@
     <w:r>
       <w:rPr>
         <w:rFonts w:ascii="Times New Roman" w:cs="Times New Roman" w:eastAsia="Times New Roman" w:hAnsi="Times New Roman"/>
+        <w:b w:val="false"/>
+        <w:bCs w:val="false"/>
         <w:i/>
         <w:iCs/>
         <w:color w:val="AAAAAA"/>
@@ -2186,11 +3955,23 @@
       <w:t xml:space="preserve">Ars Typographica</w:t>
     </w:r>
     <w:r>
+      <w:rPr>
+        <w:rFonts w:ascii="Times New Roman" w:cs="Times New Roman" w:eastAsia="Times New Roman" w:hAnsi="Times New Roman"/>
+        <w:b w:val="false"/>
+        <w:bCs w:val="false"/>
+        <w:i w:val="false"/>
+        <w:iCs w:val="false"/>
+        <w:color w:val="111111"/>
+        <w:sz w:val="16"/>
+        <w:szCs w:val="16"/>
+      </w:rPr>
       <w:t xml:space="preserve">	</w:t>
     </w:r>
     <w:r>
       <w:rPr>
         <w:rFonts w:ascii="Times New Roman" w:cs="Times New Roman" w:eastAsia="Times New Roman" w:hAnsi="Times New Roman"/>
+        <w:b w:val="false"/>
+        <w:bCs w:val="false"/>
         <w:i/>
         <w:iCs/>
         <w:color w:val="AAAAAA"/>
@@ -2327,12 +4108,6 @@
   </w:abstractNum>
   <w:num w:numId="1">
     <w:abstractNumId w:val="1"/>
-    <w:lvlOverride w:ilvl="0">
-      <w:startOverride w:val="1"/>
-    </w:lvlOverride>
-  </w:num>
-  <w:num w:numId="2">
-    <w:abstractNumId w:val="2"/>
     <w:lvlOverride w:ilvl="0">
       <w:startOverride w:val="1"/>
     </w:lvlOverride>
@@ -2562,37 +4337,5 @@
       <w:szCs w:val="22"/>
     </w:rPr>
   </w:style>
-  <w:style w:type="paragraph" w:styleId="Caption">
-    <w:name w:val="Caption"/>
-    <w:basedOn w:val="Normal"/>
-    <w:next w:val="bodyText"/>
-    <w:pPr>
-      <w:spacing w:before="60" w:after="240"/>
-    </w:pPr>
-    <w:rPr>
-      <w:rFonts w:ascii="Times New Roman" w:cs="Times New Roman" w:eastAsia="Times New Roman" w:hAnsi="Times New Roman"/>
-      <w:i/>
-      <w:iCs/>
-      <w:color w:val="666666"/>
-      <w:sz w:val="17"/>
-      <w:szCs w:val="17"/>
-    </w:rPr>
-  </w:style>
-  <w:style w:type="paragraph" w:styleId="CodeBlock">
-    <w:name w:val="Code Block"/>
-    <w:basedOn w:val="Normal"/>
-    <w:next w:val="CodeBlock"/>
-    <w:pPr>
-      <w:shd w:fill="F5F5F5" w:val="clear"/>
-      <w:spacing w:line="276" w:before="0" w:after="0"/>
-      <w:ind w:left="180" w:right="180"/>
-    </w:pPr>
-    <w:rPr>
-      <w:rFonts w:ascii="Courier New" w:cs="Courier New" w:eastAsia="Courier New" w:hAnsi="Courier New"/>
-      <w:color w:val="111111"/>
-      <w:sz w:val="18"/>
-      <w:szCs w:val="18"/>
-    </w:rPr>
-  </w:style>
 </w:styles>
 </file>
</xml_diff>